<commit_message>
Update of the User Guide
</commit_message>
<xml_diff>
--- a/SailingOrdersDFN_User_Manual.docx
+++ b/SailingOrdersDFN_User_Manual.docx
@@ -1215,7 +1215,25 @@
           <w:color w:val="000000" w:themeColor="text1"/>
           <w:lang w:val="en-US"/>
         </w:rPr>
-        <w:t xml:space="preserve"> If it is already installed it will show up under C:\rtools40. If it exists you do not need to do anything.</w:t>
+        <w:t xml:space="preserve"> If it is already installed it will show up under C:\rtools40. If it </w:t>
+      </w:r>
+      <w:proofErr w:type="gramStart"/>
+      <w:r>
+        <w:rPr>
+          <w:rFonts w:ascii="Calibri" w:eastAsia="Calibri" w:hAnsi="Calibri" w:cs="Calibri"/>
+          <w:color w:val="000000" w:themeColor="text1"/>
+          <w:lang w:val="en-US"/>
+        </w:rPr>
+        <w:t>exists</w:t>
+      </w:r>
+      <w:proofErr w:type="gramEnd"/>
+      <w:r>
+        <w:rPr>
+          <w:rFonts w:ascii="Calibri" w:eastAsia="Calibri" w:hAnsi="Calibri" w:cs="Calibri"/>
+          <w:color w:val="000000" w:themeColor="text1"/>
+          <w:lang w:val="en-US"/>
+        </w:rPr>
+        <w:t xml:space="preserve"> you do not need to do anything.</w:t>
       </w:r>
     </w:p>
     <w:p>
@@ -1582,7 +1600,25 @@
           <w:color w:val="000000" w:themeColor="text1"/>
           <w:lang w:val="en-US"/>
         </w:rPr>
-        <w:t>If you get errors indicating there are missing packages</w:t>
+        <w:t xml:space="preserve">If you get errors </w:t>
+      </w:r>
+      <w:proofErr w:type="gramStart"/>
+      <w:r>
+        <w:rPr>
+          <w:rFonts w:ascii="Calibri" w:eastAsia="Calibri" w:hAnsi="Calibri" w:cs="Calibri"/>
+          <w:color w:val="000000" w:themeColor="text1"/>
+          <w:lang w:val="en-US"/>
+        </w:rPr>
+        <w:t>indicating</w:t>
+      </w:r>
+      <w:proofErr w:type="gramEnd"/>
+      <w:r>
+        <w:rPr>
+          <w:rFonts w:ascii="Calibri" w:eastAsia="Calibri" w:hAnsi="Calibri" w:cs="Calibri"/>
+          <w:color w:val="000000" w:themeColor="text1"/>
+          <w:lang w:val="en-US"/>
+        </w:rPr>
+        <w:t xml:space="preserve"> there are missing packages</w:t>
       </w:r>
       <w:r>
         <w:rPr>
@@ -1757,7 +1793,25 @@
           <w:color w:val="000000" w:themeColor="text1"/>
           <w:lang w:val="en-US"/>
         </w:rPr>
-        <w:t>If you get errors about packages install them manually by going to the bottom right panel, selecting the Packages tab and clicking install. There type in the name(s) of missing packages and repeat steps 10a and 10b.</w:t>
+        <w:t xml:space="preserve">If you get errors about packages install them manually by going to the bottom right panel, selecting the Packages </w:t>
+      </w:r>
+      <w:proofErr w:type="gramStart"/>
+      <w:r>
+        <w:rPr>
+          <w:rFonts w:ascii="Calibri" w:eastAsia="Calibri" w:hAnsi="Calibri" w:cs="Calibri"/>
+          <w:color w:val="000000" w:themeColor="text1"/>
+          <w:lang w:val="en-US"/>
+        </w:rPr>
+        <w:t>tab</w:t>
+      </w:r>
+      <w:proofErr w:type="gramEnd"/>
+      <w:r>
+        <w:rPr>
+          <w:rFonts w:ascii="Calibri" w:eastAsia="Calibri" w:hAnsi="Calibri" w:cs="Calibri"/>
+          <w:color w:val="000000" w:themeColor="text1"/>
+          <w:lang w:val="en-US"/>
+        </w:rPr>
+        <w:t xml:space="preserve"> and clicking install. There type in the name(s) of missing packages and repeat steps 10a and 10b.</w:t>
       </w:r>
     </w:p>
     <w:p>
@@ -1788,13 +1842,23 @@
         </w:rPr>
         <w:t xml:space="preserve">package </w:t>
       </w:r>
-      <w:r>
-        <w:rPr>
-          <w:rFonts w:ascii="Calibri" w:eastAsia="Calibri" w:hAnsi="Calibri" w:cs="Calibri"/>
-          <w:color w:val="000000" w:themeColor="text1"/>
-          <w:lang w:val="en-US"/>
-        </w:rPr>
-        <w:t>installations you are asked the following</w:t>
+      <w:proofErr w:type="gramStart"/>
+      <w:r>
+        <w:rPr>
+          <w:rFonts w:ascii="Calibri" w:eastAsia="Calibri" w:hAnsi="Calibri" w:cs="Calibri"/>
+          <w:color w:val="000000" w:themeColor="text1"/>
+          <w:lang w:val="en-US"/>
+        </w:rPr>
+        <w:t>installations</w:t>
+      </w:r>
+      <w:proofErr w:type="gramEnd"/>
+      <w:r>
+        <w:rPr>
+          <w:rFonts w:ascii="Calibri" w:eastAsia="Calibri" w:hAnsi="Calibri" w:cs="Calibri"/>
+          <w:color w:val="000000" w:themeColor="text1"/>
+          <w:lang w:val="en-US"/>
+        </w:rPr>
+        <w:t xml:space="preserve"> you are asked the following</w:t>
       </w:r>
     </w:p>
     <w:p>
@@ -1986,6 +2050,7 @@
         <w:t xml:space="preserve">Warning in </w:t>
       </w:r>
       <w:proofErr w:type="spellStart"/>
+      <w:proofErr w:type="gramStart"/>
       <w:r>
         <w:rPr>
           <w:rFonts w:ascii="Calibri" w:eastAsia="Calibri" w:hAnsi="Calibri" w:cs="Calibri"/>
@@ -1999,6 +2064,7 @@
         <w:t>file.copy</w:t>
       </w:r>
       <w:proofErr w:type="spellEnd"/>
+      <w:proofErr w:type="gramEnd"/>
       <w:r>
         <w:rPr>
           <w:rFonts w:ascii="Calibri" w:eastAsia="Calibri" w:hAnsi="Calibri" w:cs="Calibri"/>
@@ -2192,7 +2258,43 @@
           <w:color w:val="000000" w:themeColor="text1"/>
           <w:lang w:val="en-US"/>
         </w:rPr>
-        <w:t>go to the bottom right panel, locate under the packages tab the problematic package and click on the X mark that is in the circle at the far right of the row. Select to uninstall the package and then re-install it using step 10c but this time select Yes to restarting R</w:t>
+        <w:t xml:space="preserve">go to the bottom right panel, locate under the packages tab the problematic </w:t>
+      </w:r>
+      <w:proofErr w:type="gramStart"/>
+      <w:r>
+        <w:rPr>
+          <w:rFonts w:ascii="Calibri" w:eastAsia="Calibri" w:hAnsi="Calibri" w:cs="Calibri"/>
+          <w:color w:val="000000" w:themeColor="text1"/>
+          <w:lang w:val="en-US"/>
+        </w:rPr>
+        <w:t>package</w:t>
+      </w:r>
+      <w:proofErr w:type="gramEnd"/>
+      <w:r>
+        <w:rPr>
+          <w:rFonts w:ascii="Calibri" w:eastAsia="Calibri" w:hAnsi="Calibri" w:cs="Calibri"/>
+          <w:color w:val="000000" w:themeColor="text1"/>
+          <w:lang w:val="en-US"/>
+        </w:rPr>
+        <w:t xml:space="preserve"> and click on the X mark that is in the circle at the far right of the row. Select to uninstall the package and then re-install it using step </w:t>
+      </w:r>
+      <w:proofErr w:type="gramStart"/>
+      <w:r>
+        <w:rPr>
+          <w:rFonts w:ascii="Calibri" w:eastAsia="Calibri" w:hAnsi="Calibri" w:cs="Calibri"/>
+          <w:color w:val="000000" w:themeColor="text1"/>
+          <w:lang w:val="en-US"/>
+        </w:rPr>
+        <w:t>10c</w:t>
+      </w:r>
+      <w:proofErr w:type="gramEnd"/>
+      <w:r>
+        <w:rPr>
+          <w:rFonts w:ascii="Calibri" w:eastAsia="Calibri" w:hAnsi="Calibri" w:cs="Calibri"/>
+          <w:color w:val="000000" w:themeColor="text1"/>
+          <w:lang w:val="en-US"/>
+        </w:rPr>
+        <w:t xml:space="preserve"> but this time select Yes to restarting R</w:t>
       </w:r>
     </w:p>
     <w:p>
@@ -2450,13 +2552,11 @@
       <w:r>
         <w:t xml:space="preserve"> (</w:t>
       </w:r>
-      <w:proofErr w:type="spellStart"/>
-      <w:r>
-        <w:t>ut</w:t>
-      </w:r>
-      <w:proofErr w:type="spellEnd"/>
-      <w:r>
-        <w:t xml:space="preserve"> see further down for instructions).</w:t>
+      <w:r>
+        <w:t>b</w:t>
+      </w:r>
+      <w:r>
+        <w:t>ut see further down for instructions).</w:t>
       </w:r>
       <w:r>
         <w:t xml:space="preserve"> </w:t>
@@ -2534,7 +2634,7 @@
         <w:t>The “</w:t>
       </w:r>
       <w:r>
-        <w:t>SO_input_dataframes.xlsx</w:t>
+        <w:t>input_dataframes.xlsx</w:t>
       </w:r>
       <w:r>
         <w:t>” is filled in as completely as possible.</w:t>
@@ -2621,7 +2721,7 @@
       </w:r>
       <w:proofErr w:type="spellStart"/>
       <w:r>
-        <w:t>SO.tab.captions</w:t>
+        <w:t>tab_captions</w:t>
       </w:r>
       <w:proofErr w:type="spellEnd"/>
       <w:r>
@@ -2630,7 +2730,15 @@
     </w:p>
     <w:p>
       <w:r>
-        <w:t>If specific formatting is required for elements of the various tables the user can do it either in the Excel file using specific rules or do it manually every time that the output document will be compiled</w:t>
+        <w:t xml:space="preserve">If specific formatting is required for elements of the various </w:t>
+      </w:r>
+      <w:proofErr w:type="gramStart"/>
+      <w:r>
+        <w:t>tables</w:t>
+      </w:r>
+      <w:proofErr w:type="gramEnd"/>
+      <w:r>
+        <w:t xml:space="preserve"> the user can do it either in the Excel file using specific rules or do it manually every time that the output document will be compiled</w:t>
       </w:r>
       <w:r>
         <w:t>.</w:t>
@@ -2695,7 +2803,21 @@
         <w:rPr>
           <w:lang w:val="en-US"/>
         </w:rPr>
-        <w:t xml:space="preserve">, e.g. </w:t>
+        <w:t xml:space="preserve">, </w:t>
+      </w:r>
+      <w:proofErr w:type="gramStart"/>
+      <w:r>
+        <w:rPr>
+          <w:lang w:val="en-US"/>
+        </w:rPr>
+        <w:t>e.g.</w:t>
+      </w:r>
+      <w:proofErr w:type="gramEnd"/>
+      <w:r>
+        <w:rPr>
+          <w:lang w:val="en-US"/>
+        </w:rPr>
+        <w:t xml:space="preserve"> </w:t>
       </w:r>
       <w:r>
         <w:rPr>
@@ -2748,7 +2870,21 @@
         <w:rPr>
           <w:lang w:val="en-US"/>
         </w:rPr>
-        <w:t xml:space="preserve">For text to appear in bold surround the word with double asterisks, e.g. **bold** will be in the output </w:t>
+        <w:t xml:space="preserve">For text to appear in bold surround the word with double asterisks, </w:t>
+      </w:r>
+      <w:proofErr w:type="gramStart"/>
+      <w:r>
+        <w:rPr>
+          <w:lang w:val="en-US"/>
+        </w:rPr>
+        <w:t>e.g.</w:t>
+      </w:r>
+      <w:proofErr w:type="gramEnd"/>
+      <w:r>
+        <w:rPr>
+          <w:lang w:val="en-US"/>
+        </w:rPr>
+        <w:t xml:space="preserve"> **bold** will be in the output </w:t>
       </w:r>
       <w:r>
         <w:rPr>
@@ -2910,6 +3046,71 @@
     </w:p>
     <w:p>
       <w:pPr>
+        <w:pStyle w:val="ListParagraph"/>
+        <w:numPr>
+          <w:ilvl w:val="0"/>
+          <w:numId w:val="5"/>
+        </w:numPr>
+        <w:rPr>
+          <w:rFonts w:eastAsiaTheme="minorEastAsia"/>
+          <w:lang w:val="en-US"/>
+        </w:rPr>
+      </w:pPr>
+      <w:r>
+        <w:rPr>
+          <w:lang w:val="en-US"/>
+        </w:rPr>
+        <w:t>Color</w:t>
+      </w:r>
+      <w:r>
+        <w:rPr>
+          <w:lang w:val="en-US"/>
+        </w:rPr>
+        <w:t>-coding in the excel files does not work. Footnotes need to be used instead. To include a footnote</w:t>
+      </w:r>
+      <w:r>
+        <w:rPr>
+          <w:lang w:val="en-US"/>
+        </w:rPr>
+        <w:t>, in the cell that the footnote applies the following without the quotes “</w:t>
+      </w:r>
+      <w:proofErr w:type="gramStart"/>
+      <w:r>
+        <w:rPr>
+          <w:lang w:val="en-US"/>
+        </w:rPr>
+        <w:t>^[</w:t>
+      </w:r>
+      <w:proofErr w:type="gramEnd"/>
+      <w:r>
+        <w:rPr>
+          <w:lang w:val="en-US"/>
+        </w:rPr>
+        <w:t>footnote text]”</w:t>
+      </w:r>
+      <w:r>
+        <w:rPr>
+          <w:lang w:val="en-US"/>
+        </w:rPr>
+        <w:t>. More footnotes (</w:t>
+      </w:r>
+      <w:proofErr w:type="gramStart"/>
+      <w:r>
+        <w:rPr>
+          <w:lang w:val="en-US"/>
+        </w:rPr>
+        <w:t>e.g.</w:t>
+      </w:r>
+      <w:proofErr w:type="gramEnd"/>
+      <w:r>
+        <w:rPr>
+          <w:lang w:val="en-US"/>
+        </w:rPr>
+        <w:t xml:space="preserve"> 1, 2, 3) will appear automatically as long as the user adds additional notations as the one shown in the square brackets above.</w:t>
+      </w:r>
+    </w:p>
+    <w:p>
+      <w:pPr>
         <w:rPr>
           <w:lang w:val="en-US"/>
         </w:rPr>
@@ -2931,10 +3132,35 @@
         <w:t>“</w:t>
       </w:r>
       <w:r>
-        <w:t>SO_input_dataframes.xlsx</w:t>
+        <w:t>input_dataframes.xlsx</w:t>
       </w:r>
       <w:r>
         <w:t xml:space="preserve">” sheets. The tidier and plainer a table is, the rendering will be the intended one. </w:t>
+      </w:r>
+      <w:r>
+        <w:t>In some cases, additional columns can be added if required, but this is table-</w:t>
+      </w:r>
+      <w:proofErr w:type="spellStart"/>
+      <w:r>
+        <w:t>dependen</w:t>
+      </w:r>
+      <w:r>
+        <w:t>d</w:t>
+      </w:r>
+      <w:proofErr w:type="spellEnd"/>
+      <w:r>
+        <w:t xml:space="preserve">. In the </w:t>
+      </w:r>
+      <w:proofErr w:type="spellStart"/>
+      <w:r>
+        <w:t>reqparttab</w:t>
+      </w:r>
+      <w:proofErr w:type="spellEnd"/>
+      <w:r>
+        <w:t xml:space="preserve"> columns A, B and C are not to be renamed</w:t>
+      </w:r>
+      <w:r>
+        <w:t xml:space="preserve">. </w:t>
       </w:r>
       <w:r>
         <w:t>If complicated table structures are required and inevitable, contact Piera Carpi or Nikos Nikolioudakis.</w:t>
@@ -2957,26 +3183,28 @@
       </w:r>
       <w:proofErr w:type="spellEnd"/>
       <w:r>
-        <w:t xml:space="preserve"> or .jpeg. The code might need to be adjusted accordingly if .jpeg images are included. Once the user has placed the images in the folder, correspondence must be ensured between the file names of the images and what is listed </w:t>
+        <w:t xml:space="preserve"> or .jpeg. The code might need to be adjusted accordingly if .jpeg images are included. Once the user </w:t>
+      </w:r>
+      <w:r>
+        <w:lastRenderedPageBreak/>
+        <w:t>has placed the images in the folder, correspondence must be ensured between the file names of the images and what is listed in the “</w:t>
       </w:r>
       <w:proofErr w:type="spellStart"/>
       <w:r>
-        <w:t>listed</w:t>
+        <w:t>fig</w:t>
+      </w:r>
+      <w:r>
+        <w:t>_</w:t>
+      </w:r>
+      <w:r>
+        <w:t>captions</w:t>
       </w:r>
       <w:proofErr w:type="spellEnd"/>
       <w:r>
-        <w:t xml:space="preserve"> in the “</w:t>
-      </w:r>
-      <w:proofErr w:type="spellStart"/>
-      <w:r>
-        <w:t>SO.fig.captions</w:t>
-      </w:r>
-      <w:proofErr w:type="spellEnd"/>
-      <w:r>
         <w:t>” sheet of the “</w:t>
       </w:r>
       <w:r>
-        <w:t>SO_input_dataframes.xlsx</w:t>
+        <w:t>input_dataframes.xlsx</w:t>
       </w:r>
       <w:r>
         <w:t xml:space="preserve">”. Otherwise, the image captions will not be rendered and cross-referencing in the output document will not work as intended. </w:t>
@@ -2989,7 +3217,6 @@
           <w:b/>
           <w:bCs/>
         </w:rPr>
-        <w:lastRenderedPageBreak/>
         <w:t xml:space="preserve">For </w:t>
       </w:r>
       <w:r>
@@ -3147,15 +3374,23 @@
         <w:t>SailingOrdersDFN.doc</w:t>
       </w:r>
       <w:r>
-        <w:t>x” is in the .</w:t>
+        <w:t xml:space="preserve">x” is in </w:t>
+      </w:r>
+      <w:proofErr w:type="gramStart"/>
+      <w:r>
+        <w:t>the .</w:t>
       </w:r>
       <w:proofErr w:type="spellStart"/>
       <w:r>
         <w:t>Rproj</w:t>
       </w:r>
       <w:proofErr w:type="spellEnd"/>
+      <w:proofErr w:type="gramEnd"/>
       <w:r>
         <w:t xml:space="preserve"> directory. </w:t>
+      </w:r>
+      <w:r>
+        <w:t>Ensure that the input_dataframes.xlsx is not open in your Excel before knitting.</w:t>
       </w:r>
     </w:p>
     <w:p>
@@ -3203,7 +3438,15 @@
     <w:p/>
     <w:p>
       <w:r>
-        <w:t>At this point, the draft Sailing Orders can be shared with the pre-survey meeting participants or any other person involved</w:t>
+        <w:t xml:space="preserve">At this point, the draft Sailing Orders can be shared with the pre-survey meeting </w:t>
+      </w:r>
+      <w:proofErr w:type="gramStart"/>
+      <w:r>
+        <w:t>participants</w:t>
+      </w:r>
+      <w:proofErr w:type="gramEnd"/>
+      <w:r>
+        <w:t xml:space="preserve"> or any other person involved</w:t>
       </w:r>
       <w:r>
         <w:t xml:space="preserve">, as a .docx. </w:t>
@@ -3294,101 +3537,103 @@
       <w:pPr>
         <w:pStyle w:val="Heading2"/>
       </w:pPr>
-      <w:bookmarkStart w:id="4" w:name="_Ref94084273"/>
-      <w:bookmarkStart w:id="5" w:name="_Toc101180835"/>
+      <w:bookmarkStart w:id="4" w:name="_Toc101180835"/>
+      <w:bookmarkStart w:id="5" w:name="_Ref94084273"/>
       <w:r>
         <w:lastRenderedPageBreak/>
         <w:t>Details</w:t>
       </w:r>
+      <w:bookmarkEnd w:id="4"/>
+      <w:r>
+        <w:t xml:space="preserve"> </w:t>
+      </w:r>
+    </w:p>
+    <w:p>
+      <w:pPr>
+        <w:pStyle w:val="Heading3"/>
+      </w:pPr>
+      <w:bookmarkStart w:id="6" w:name="_Toc101180836"/>
       <w:bookmarkEnd w:id="5"/>
       <w:r>
-        <w:t xml:space="preserve"> </w:t>
+        <w:t>Catch sampling workflow</w:t>
+      </w:r>
+      <w:bookmarkEnd w:id="6"/>
+    </w:p>
+    <w:p>
+      <w:r>
+        <w:t xml:space="preserve">Under the _images folder, </w:t>
+      </w:r>
+      <w:r>
+        <w:t>there is the “</w:t>
+      </w:r>
+      <w:r>
+        <w:t>c</w:t>
+      </w:r>
+      <w:r>
+        <w:t>atchsamplingworkflow.pptx</w:t>
+      </w:r>
+      <w:r>
+        <w:t>”. This .pptx is to be modified accordingly during the pre-survey meeting and once finalized it should be saved in the _images folder as .</w:t>
+      </w:r>
+      <w:proofErr w:type="spellStart"/>
+      <w:r>
+        <w:t>png</w:t>
+      </w:r>
+      <w:proofErr w:type="spellEnd"/>
+      <w:r>
+        <w:t xml:space="preserve"> with the name “</w:t>
+      </w:r>
+      <w:proofErr w:type="spellStart"/>
+      <w:r>
+        <w:t>catchsamplingworkflow</w:t>
+      </w:r>
+      <w:proofErr w:type="spellEnd"/>
+      <w:r>
+        <w:t>”.</w:t>
       </w:r>
     </w:p>
     <w:p>
       <w:pPr>
         <w:pStyle w:val="Heading3"/>
       </w:pPr>
-      <w:bookmarkStart w:id="6" w:name="_Toc101180836"/>
-      <w:bookmarkEnd w:id="4"/>
-      <w:r>
-        <w:t>Catch sampling workflow</w:t>
-      </w:r>
-      <w:bookmarkEnd w:id="6"/>
-    </w:p>
-    <w:p>
-      <w:r>
-        <w:t xml:space="preserve">Under the _images folder, </w:t>
-      </w:r>
-      <w:r>
-        <w:t>there is the “</w:t>
-      </w:r>
-      <w:r>
-        <w:t>c</w:t>
-      </w:r>
-      <w:r>
-        <w:t>atchsamplingworkflow.pptx</w:t>
-      </w:r>
-      <w:r>
-        <w:t>”. This .pptx is to be modified accordingly during the pre-survey meeting and once finalized it should be saved in the _images folder as .</w:t>
+      <w:bookmarkStart w:id="7" w:name="_Toc101180837"/>
+      <w:r>
+        <w:t>Image size</w:t>
+      </w:r>
+      <w:bookmarkEnd w:id="7"/>
+    </w:p>
+    <w:p>
+      <w:pPr>
+        <w:rPr>
+          <w:lang w:val="en-US"/>
+        </w:rPr>
+      </w:pPr>
+      <w:r>
+        <w:t xml:space="preserve">The output image size is controlled from within the code chunks, through the arguments </w:t>
       </w:r>
       <w:proofErr w:type="spellStart"/>
-      <w:r>
-        <w:t>png</w:t>
+      <w:proofErr w:type="gramStart"/>
+      <w:r>
+        <w:t>fig.width</w:t>
       </w:r>
       <w:proofErr w:type="spellEnd"/>
-      <w:r>
-        <w:t xml:space="preserve"> with the name “</w:t>
+      <w:proofErr w:type="gramEnd"/>
+      <w:r>
+        <w:t xml:space="preserve"> and </w:t>
       </w:r>
       <w:proofErr w:type="spellStart"/>
       <w:r>
-        <w:t>catchsamplingworkflow</w:t>
+        <w:t>fig.height</w:t>
       </w:r>
       <w:proofErr w:type="spellEnd"/>
       <w:r>
-        <w:t>”.</w:t>
+        <w:t>. The user should modify the images accordingly to achieve the expected output. Note: Image sizes for images that are standard for each survey should not be tampered with, as the set values provide an acceptable output.</w:t>
       </w:r>
     </w:p>
     <w:p>
       <w:pPr>
         <w:pStyle w:val="Heading3"/>
       </w:pPr>
-      <w:bookmarkStart w:id="7" w:name="_Toc101180837"/>
-      <w:r>
-        <w:t>Image size</w:t>
-      </w:r>
-      <w:bookmarkEnd w:id="7"/>
-    </w:p>
-    <w:p>
-      <w:pPr>
-        <w:rPr>
-          <w:lang w:val="en-US"/>
-        </w:rPr>
-      </w:pPr>
-      <w:r>
-        <w:t xml:space="preserve">The output image size is controlled from within the code chunks, through the arguments </w:t>
-      </w:r>
-      <w:proofErr w:type="spellStart"/>
-      <w:r>
-        <w:t>fig.width</w:t>
-      </w:r>
-      <w:proofErr w:type="spellEnd"/>
-      <w:r>
-        <w:t xml:space="preserve"> and </w:t>
-      </w:r>
-      <w:proofErr w:type="spellStart"/>
-      <w:r>
-        <w:t>fig.height</w:t>
-      </w:r>
-      <w:proofErr w:type="spellEnd"/>
-      <w:r>
-        <w:t>. The user should modify the images accordingly to achieve the expected output. Note: Image sizes for images that are standard for each survey should not be tampered with, as the set values provide an acceptable output.</w:t>
-      </w:r>
-    </w:p>
-    <w:p>
-      <w:pPr>
-        <w:pStyle w:val="Heading3"/>
-      </w:pPr>
       <w:bookmarkStart w:id="8" w:name="_Toc101180838"/>
       <w:r>
         <w:t>Page orientation</w:t>
@@ -3397,7 +3642,15 @@
     </w:p>
     <w:p>
       <w:r>
-        <w:t xml:space="preserve">If the user needs to change the orientation of a section this is achievable by using the following </w:t>
+        <w:t xml:space="preserve">If the user needs to change the orientation of a </w:t>
+      </w:r>
+      <w:proofErr w:type="gramStart"/>
+      <w:r>
+        <w:t>section</w:t>
+      </w:r>
+      <w:proofErr w:type="gramEnd"/>
+      <w:r>
+        <w:t xml:space="preserve"> this is achievable by using the following </w:t>
       </w:r>
       <w:r>
         <w:t xml:space="preserve">red highlighted </w:t>
@@ -3414,11 +3667,19 @@
       <w:r>
         <w:br/>
       </w:r>
+      <w:proofErr w:type="gramStart"/>
       <w:r>
         <w:rPr>
           <w:color w:val="FF0000"/>
         </w:rPr>
-        <w:t>&lt;!---BLOCK_LANDSCAPE_START---&gt;</w:t>
+        <w:t>&lt;!---</w:t>
+      </w:r>
+      <w:proofErr w:type="gramEnd"/>
+      <w:r>
+        <w:rPr>
+          <w:color w:val="FF0000"/>
+        </w:rPr>
+        <w:t>BLOCK_LANDSCAPE_START---&gt;</w:t>
       </w:r>
     </w:p>
     <w:p>
@@ -3442,23 +3703,19 @@
           <w:color w:val="FF0000"/>
         </w:rPr>
       </w:pPr>
+      <w:proofErr w:type="gramStart"/>
       <w:r>
         <w:rPr>
           <w:color w:val="FF0000"/>
         </w:rPr>
-        <w:t>&lt;!---BLOCK_LANDSCAPE_ST</w:t>
-      </w:r>
+        <w:t>&lt;!---</w:t>
+      </w:r>
+      <w:proofErr w:type="gramEnd"/>
       <w:r>
         <w:rPr>
           <w:color w:val="FF0000"/>
         </w:rPr>
-        <w:t>OP</w:t>
-      </w:r>
-      <w:r>
-        <w:rPr>
-          <w:color w:val="FF0000"/>
-        </w:rPr>
-        <w:t>---&gt;</w:t>
+        <w:t>BLOCK_LANDSCAPE_STOP---&gt;</w:t>
       </w:r>
     </w:p>
     <w:p/>
@@ -3498,14 +3755,22 @@
         <w:t>Add a new sheet in the “</w:t>
       </w:r>
       <w:r>
-        <w:t>SO_input_dataframes.xlsx</w:t>
-      </w:r>
-      <w:r>
-        <w:t>”. Name it using a similar pattern to the existing tables, e.g. “</w:t>
+        <w:t>input_dataframes.xlsx</w:t>
+      </w:r>
+      <w:r>
+        <w:t xml:space="preserve">”. Name it </w:t>
+      </w:r>
+      <w:proofErr w:type="gramStart"/>
+      <w:r>
+        <w:t>using</w:t>
+      </w:r>
+      <w:proofErr w:type="gramEnd"/>
+      <w:r>
+        <w:t xml:space="preserve"> a similar pattern to the existing tables, e.g. “</w:t>
       </w:r>
       <w:proofErr w:type="spellStart"/>
       <w:r>
-        <w:t>SO_taxonomytab</w:t>
+        <w:t>taxonomytab</w:t>
       </w:r>
       <w:proofErr w:type="spellEnd"/>
       <w:r>
@@ -3525,7 +3790,7 @@
       </w:r>
       <w:proofErr w:type="spellStart"/>
       <w:r>
-        <w:t>SO_tab_captions</w:t>
+        <w:t>tab_captions</w:t>
       </w:r>
       <w:proofErr w:type="spellEnd"/>
       <w:r>
@@ -3571,11 +3836,19 @@
         </w:numPr>
       </w:pPr>
       <w:r>
-        <w:t>Let’s assume that you want to include the new table that you created in step 1 under “ANNEX V. Survey-specific additional sampling” location. Find any other table code chunk, e.g. the table “</w:t>
+        <w:t xml:space="preserve">Let’s assume that you want to include the new table that you created in step 1 under “ANNEX V. Survey-specific additional sampling” location. Find any other table code chunk, </w:t>
+      </w:r>
+      <w:proofErr w:type="gramStart"/>
+      <w:r>
+        <w:t>e.g.</w:t>
+      </w:r>
+      <w:proofErr w:type="gramEnd"/>
+      <w:r>
+        <w:t xml:space="preserve"> the table “</w:t>
       </w:r>
       <w:proofErr w:type="spellStart"/>
       <w:r>
-        <w:t>SO_equipmenttab</w:t>
+        <w:t>equipmenttab</w:t>
       </w:r>
       <w:proofErr w:type="spellEnd"/>
       <w:r>
@@ -3595,11 +3868,19 @@
       </w:r>
       <w:proofErr w:type="spellStart"/>
       <w:r>
-        <w:t>Ctrl+C</w:t>
+        <w:t>Ctrl+</w:t>
+      </w:r>
+      <w:proofErr w:type="gramStart"/>
+      <w:r>
+        <w:t>C</w:t>
       </w:r>
       <w:proofErr w:type="spellEnd"/>
       <w:r>
-        <w:t xml:space="preserve"> . The code chunk is looking like this:</w:t>
+        <w:t xml:space="preserve"> .</w:t>
+      </w:r>
+      <w:proofErr w:type="gramEnd"/>
+      <w:r>
+        <w:t xml:space="preserve"> The code chunk is looking like this:</w:t>
       </w:r>
     </w:p>
     <w:p>
@@ -3692,16 +3973,13 @@
       </w:r>
       <w:proofErr w:type="spellStart"/>
       <w:r>
-        <w:t>SO_equipmenttab</w:t>
+        <w:t>equipmenttab</w:t>
       </w:r>
       <w:proofErr w:type="spellEnd"/>
       <w:r>
         <w:t>” with “</w:t>
       </w:r>
       <w:proofErr w:type="spellStart"/>
-      <w:r>
-        <w:t>SO_</w:t>
-      </w:r>
       <w:r>
         <w:t>taxonomy</w:t>
       </w:r>
@@ -3725,25 +4003,41 @@
         <w:t xml:space="preserve">If a cross-reference to the table is needed somewhere in the text this can be done be adding the notation: </w:t>
       </w:r>
       <w:r>
-        <w:t>Table @ref(tab:SO_</w:t>
+        <w:t>Table @ref(</w:t>
+      </w:r>
+      <w:proofErr w:type="gramStart"/>
+      <w:r>
+        <w:t>tab:</w:t>
       </w:r>
       <w:r>
         <w:t>taxonomy</w:t>
       </w:r>
       <w:r>
-        <w:t>tab)</w:t>
+        <w:t>tab</w:t>
+      </w:r>
+      <w:proofErr w:type="gramEnd"/>
+      <w:r>
+        <w:t>)</w:t>
       </w:r>
       <w:r>
         <w:t xml:space="preserve">. If the table is placed in an Annex, then the notation is slightly modified to: </w:t>
       </w:r>
       <w:r>
-        <w:t>Table @ref(tab:SO_</w:t>
+        <w:t>Table @ref(</w:t>
+      </w:r>
+      <w:proofErr w:type="gramStart"/>
+      <w:r>
+        <w:t>tab:</w:t>
       </w:r>
       <w:r>
         <w:t>taxonomy</w:t>
       </w:r>
       <w:r>
-        <w:t>tab) (ANNEX V)</w:t>
+        <w:t>tab</w:t>
+      </w:r>
+      <w:proofErr w:type="gramEnd"/>
+      <w:r>
+        <w:t>) (ANNEX V)</w:t>
       </w:r>
     </w:p>
     <w:p/>
@@ -3774,7 +4068,15 @@
         </w:numPr>
       </w:pPr>
       <w:r>
-        <w:t>Add a new image in the _images folder of the project. Name it using a similar pattern to the existing images, e.g. “</w:t>
+        <w:t xml:space="preserve">Add a new image in the _images folder of the project. Name it </w:t>
+      </w:r>
+      <w:proofErr w:type="gramStart"/>
+      <w:r>
+        <w:t>using</w:t>
+      </w:r>
+      <w:proofErr w:type="gramEnd"/>
+      <w:r>
+        <w:t xml:space="preserve"> a similar pattern to the existing images, e.g. “</w:t>
       </w:r>
       <w:proofErr w:type="spellStart"/>
       <w:r>
@@ -3806,9 +4108,6 @@
       </w:r>
       <w:proofErr w:type="spellStart"/>
       <w:r>
-        <w:t>SO_</w:t>
-      </w:r>
-      <w:r>
         <w:t>fig</w:t>
       </w:r>
       <w:r>
@@ -3819,7 +4118,7 @@
         <w:t>” sheet of the “</w:t>
       </w:r>
       <w:r>
-        <w:t>SO_input_dataframes.xlsx</w:t>
+        <w:t>input_dataframes.xlsx</w:t>
       </w:r>
       <w:r>
         <w:t>”, add under the fig.name column the name of the image you added in step 1 and provide a caption under the caption column.</w:t>
@@ -3864,7 +4163,15 @@
         </w:numPr>
       </w:pPr>
       <w:r>
-        <w:t>Let’s assume that you want to include the new image that you created in step 1 under “ANNEX V. Survey-specific additional sampling” location. Find any other image code chunk, e.g. the image “</w:t>
+        <w:t xml:space="preserve">Let’s assume that you want to include the new image that you created in step 1 under “ANNEX V. Survey-specific additional sampling” location. Find any other image code chunk, </w:t>
+      </w:r>
+      <w:proofErr w:type="gramStart"/>
+      <w:r>
+        <w:t>e.g.</w:t>
+      </w:r>
+      <w:proofErr w:type="gramEnd"/>
+      <w:r>
+        <w:t xml:space="preserve"> the image “</w:t>
       </w:r>
       <w:proofErr w:type="spellStart"/>
       <w:r>
@@ -3894,11 +4201,19 @@
       </w:r>
       <w:proofErr w:type="spellStart"/>
       <w:r>
-        <w:t>Ctrl+C</w:t>
+        <w:t>Ctrl+</w:t>
+      </w:r>
+      <w:proofErr w:type="gramStart"/>
+      <w:r>
+        <w:t>C</w:t>
       </w:r>
       <w:proofErr w:type="spellEnd"/>
       <w:r>
-        <w:t xml:space="preserve"> . The code chunk is looking like this:</w:t>
+        <w:t xml:space="preserve"> .</w:t>
+      </w:r>
+      <w:proofErr w:type="gramEnd"/>
+      <w:r>
+        <w:t xml:space="preserve"> The code chunk is looking like this:</w:t>
       </w:r>
     </w:p>
     <w:p>
@@ -4023,13 +4338,29 @@
         <w:t xml:space="preserve">If a cross-reference to the table is needed somewhere in the text this can be done be adding the notation: </w:t>
       </w:r>
       <w:r>
-        <w:t>Figure @ref(fig:surveyareamapSOfig)</w:t>
+        <w:t>Figure @ref(</w:t>
+      </w:r>
+      <w:proofErr w:type="gramStart"/>
+      <w:r>
+        <w:t>fig:surveyareamapSOfig</w:t>
+      </w:r>
+      <w:proofErr w:type="gramEnd"/>
+      <w:r>
+        <w:t>)</w:t>
       </w:r>
       <w:r>
         <w:t xml:space="preserve">. If the image is placed in an Annex, then the notation is slightly modified to: </w:t>
       </w:r>
       <w:r>
-        <w:t>Figure @ref(fig:surveyareamapSOfig)</w:t>
+        <w:t>Figure @ref(</w:t>
+      </w:r>
+      <w:proofErr w:type="gramStart"/>
+      <w:r>
+        <w:t>fig:surveyareamapSOfig</w:t>
+      </w:r>
+      <w:proofErr w:type="gramEnd"/>
+      <w:r>
+        <w:t>)</w:t>
       </w:r>
       <w:r>
         <w:t xml:space="preserve"> (ANNEX V)</w:t>
@@ -5747,67 +6078,67 @@
       </w:pPr>
     </w:lvl>
   </w:abstractNum>
-  <w:num w:numId="1">
+  <w:num w:numId="1" w16cid:durableId="1956867094">
     <w:abstractNumId w:val="5"/>
   </w:num>
-  <w:num w:numId="2">
+  <w:num w:numId="2" w16cid:durableId="1923642442">
     <w:abstractNumId w:val="14"/>
   </w:num>
-  <w:num w:numId="3">
+  <w:num w:numId="3" w16cid:durableId="1777359482">
     <w:abstractNumId w:val="11"/>
   </w:num>
-  <w:num w:numId="4">
+  <w:num w:numId="4" w16cid:durableId="126049336">
     <w:abstractNumId w:val="9"/>
   </w:num>
-  <w:num w:numId="5">
+  <w:num w:numId="5" w16cid:durableId="1002247346">
     <w:abstractNumId w:val="0"/>
   </w:num>
-  <w:num w:numId="6">
+  <w:num w:numId="6" w16cid:durableId="1842354018">
     <w:abstractNumId w:val="15"/>
   </w:num>
-  <w:num w:numId="7">
+  <w:num w:numId="7" w16cid:durableId="1362169565">
     <w:abstractNumId w:val="13"/>
   </w:num>
-  <w:num w:numId="8">
+  <w:num w:numId="8" w16cid:durableId="202911940">
     <w:abstractNumId w:val="13"/>
     <w:lvlOverride w:ilvl="0">
       <w:startOverride w:val="1"/>
     </w:lvlOverride>
   </w:num>
-  <w:num w:numId="9">
+  <w:num w:numId="9" w16cid:durableId="2049799606">
     <w:abstractNumId w:val="1"/>
   </w:num>
-  <w:num w:numId="10">
+  <w:num w:numId="10" w16cid:durableId="514078534">
     <w:abstractNumId w:val="16"/>
   </w:num>
-  <w:num w:numId="11">
+  <w:num w:numId="11" w16cid:durableId="742070115">
     <w:abstractNumId w:val="4"/>
   </w:num>
-  <w:num w:numId="12">
+  <w:num w:numId="12" w16cid:durableId="323945420">
     <w:abstractNumId w:val="1"/>
   </w:num>
-  <w:num w:numId="13">
+  <w:num w:numId="13" w16cid:durableId="292827197">
     <w:abstractNumId w:val="10"/>
   </w:num>
-  <w:num w:numId="14">
+  <w:num w:numId="14" w16cid:durableId="965349978">
     <w:abstractNumId w:val="2"/>
   </w:num>
-  <w:num w:numId="15">
+  <w:num w:numId="15" w16cid:durableId="488862069">
     <w:abstractNumId w:val="7"/>
   </w:num>
-  <w:num w:numId="16">
+  <w:num w:numId="16" w16cid:durableId="875658855">
     <w:abstractNumId w:val="8"/>
   </w:num>
-  <w:num w:numId="17">
+  <w:num w:numId="17" w16cid:durableId="596257278">
     <w:abstractNumId w:val="3"/>
   </w:num>
-  <w:num w:numId="18">
+  <w:num w:numId="18" w16cid:durableId="1569875078">
     <w:abstractNumId w:val="12"/>
   </w:num>
-  <w:num w:numId="19">
+  <w:num w:numId="19" w16cid:durableId="342170053">
     <w:abstractNumId w:val="17"/>
   </w:num>
-  <w:num w:numId="20">
+  <w:num w:numId="20" w16cid:durableId="1844978690">
     <w:abstractNumId w:val="6"/>
   </w:num>
 </w:numbering>

</xml_diff>

<commit_message>
Further updates on the user guide
</commit_message>
<xml_diff>
--- a/SailingOrdersDFN_User_Manual.docx
+++ b/SailingOrdersDFN_User_Manual.docx
@@ -1190,6 +1190,7 @@
         <w:t xml:space="preserve">Install </w:t>
       </w:r>
       <w:hyperlink r:id="rId8">
+        <w:proofErr w:type="spellStart"/>
         <w:r>
           <w:rPr>
             <w:rStyle w:val="Hyperlink"/>
@@ -1198,6 +1199,7 @@
           </w:rPr>
           <w:t>Rtools</w:t>
         </w:r>
+        <w:proofErr w:type="spellEnd"/>
       </w:hyperlink>
       <w:r>
         <w:rPr>
@@ -1213,7 +1215,25 @@
           <w:color w:val="000000" w:themeColor="text1"/>
           <w:lang w:val="en-US"/>
         </w:rPr>
-        <w:t xml:space="preserve"> If it is already installed it will show up under C:\rtools40. If it exists you do not need to do anything.</w:t>
+        <w:t xml:space="preserve"> If it is already installed it will show up under C:\rtools40. If it </w:t>
+      </w:r>
+      <w:proofErr w:type="gramStart"/>
+      <w:r>
+        <w:rPr>
+          <w:rFonts w:ascii="Calibri" w:eastAsia="Calibri" w:hAnsi="Calibri" w:cs="Calibri"/>
+          <w:color w:val="000000" w:themeColor="text1"/>
+          <w:lang w:val="en-US"/>
+        </w:rPr>
+        <w:t>exists</w:t>
+      </w:r>
+      <w:proofErr w:type="gramEnd"/>
+      <w:r>
+        <w:rPr>
+          <w:rFonts w:ascii="Calibri" w:eastAsia="Calibri" w:hAnsi="Calibri" w:cs="Calibri"/>
+          <w:color w:val="000000" w:themeColor="text1"/>
+          <w:lang w:val="en-US"/>
+        </w:rPr>
+        <w:t xml:space="preserve"> you do not need to do anything.</w:t>
       </w:r>
     </w:p>
     <w:p>
@@ -1326,7 +1346,16 @@
           <w:color w:val="000000" w:themeColor="text1"/>
           <w:lang w:val="en-US"/>
         </w:rPr>
-        <w:t>Go to File</w:t>
+        <w:t xml:space="preserve">Go to </w:t>
+      </w:r>
+      <w:proofErr w:type="spellStart"/>
+      <w:r>
+        <w:rPr>
+          <w:rFonts w:ascii="Calibri" w:eastAsia="Calibri" w:hAnsi="Calibri" w:cs="Calibri"/>
+          <w:color w:val="000000" w:themeColor="text1"/>
+          <w:lang w:val="en-US"/>
+        </w:rPr>
+        <w:t>File</w:t>
       </w:r>
       <w:r>
         <w:rPr>
@@ -1342,8 +1371,18 @@
           <w:color w:val="000000" w:themeColor="text1"/>
           <w:lang w:val="en-US"/>
         </w:rPr>
-        <w:t xml:space="preserve">Open project and browse to the path where you have the </w:t>
-      </w:r>
+        <w:t>Open</w:t>
+      </w:r>
+      <w:proofErr w:type="spellEnd"/>
+      <w:r>
+        <w:rPr>
+          <w:rFonts w:ascii="Calibri" w:eastAsia="Calibri" w:hAnsi="Calibri" w:cs="Calibri"/>
+          <w:color w:val="000000" w:themeColor="text1"/>
+          <w:lang w:val="en-US"/>
+        </w:rPr>
+        <w:t xml:space="preserve"> project and browse to the path where you have the </w:t>
+      </w:r>
+      <w:proofErr w:type="spellStart"/>
       <w:r>
         <w:rPr>
           <w:rFonts w:ascii="Calibri" w:eastAsia="Calibri" w:hAnsi="Calibri" w:cs="Calibri"/>
@@ -1358,7 +1397,25 @@
           <w:color w:val="000000" w:themeColor="text1"/>
           <w:lang w:val="en-US"/>
         </w:rPr>
-        <w:t>.Rproj (it is in the folder S</w:t>
+        <w:t>.Rproj</w:t>
+      </w:r>
+      <w:proofErr w:type="spellEnd"/>
+      <w:r>
+        <w:rPr>
+          <w:rFonts w:ascii="Calibri" w:eastAsia="Calibri" w:hAnsi="Calibri" w:cs="Calibri"/>
+          <w:color w:val="000000" w:themeColor="text1"/>
+          <w:lang w:val="en-US"/>
+        </w:rPr>
+        <w:t xml:space="preserve"> (it is in the folder </w:t>
+      </w:r>
+      <w:proofErr w:type="spellStart"/>
+      <w:r>
+        <w:rPr>
+          <w:rFonts w:ascii="Calibri" w:eastAsia="Calibri" w:hAnsi="Calibri" w:cs="Calibri"/>
+          <w:color w:val="000000" w:themeColor="text1"/>
+          <w:lang w:val="en-US"/>
+        </w:rPr>
+        <w:t>S</w:t>
       </w:r>
       <w:r>
         <w:rPr>
@@ -1368,6 +1425,7 @@
         </w:rPr>
         <w:t>ailingOrdersDFN</w:t>
       </w:r>
+      <w:proofErr w:type="spellEnd"/>
       <w:r>
         <w:rPr>
           <w:rFonts w:ascii="Calibri" w:eastAsia="Calibri" w:hAnsi="Calibri" w:cs="Calibri"/>
@@ -1401,6 +1459,7 @@
         <w:lastRenderedPageBreak/>
         <w:t xml:space="preserve">panel) locate the </w:t>
       </w:r>
+      <w:proofErr w:type="spellStart"/>
       <w:r>
         <w:rPr>
           <w:rFonts w:ascii="Calibri" w:eastAsia="Calibri" w:hAnsi="Calibri" w:cs="Calibri"/>
@@ -1415,7 +1474,16 @@
           <w:color w:val="000000" w:themeColor="text1"/>
           <w:lang w:val="en-US"/>
         </w:rPr>
-        <w:t>.Rmd and select it. Once it opens in the top left panel you might get warnings for missing packages like the one below</w:t>
+        <w:t>.Rmd</w:t>
+      </w:r>
+      <w:proofErr w:type="spellEnd"/>
+      <w:r>
+        <w:rPr>
+          <w:rFonts w:ascii="Calibri" w:eastAsia="Calibri" w:hAnsi="Calibri" w:cs="Calibri"/>
+          <w:color w:val="000000" w:themeColor="text1"/>
+          <w:lang w:val="en-US"/>
+        </w:rPr>
+        <w:t xml:space="preserve"> and select it. Once it opens in the top left panel you might get warnings for missing packages like the one below</w:t>
       </w:r>
     </w:p>
     <w:p>
@@ -1532,7 +1600,25 @@
           <w:color w:val="000000" w:themeColor="text1"/>
           <w:lang w:val="en-US"/>
         </w:rPr>
-        <w:t>If you get errors indicating there are missing packages</w:t>
+        <w:t xml:space="preserve">If you get errors </w:t>
+      </w:r>
+      <w:proofErr w:type="gramStart"/>
+      <w:r>
+        <w:rPr>
+          <w:rFonts w:ascii="Calibri" w:eastAsia="Calibri" w:hAnsi="Calibri" w:cs="Calibri"/>
+          <w:color w:val="000000" w:themeColor="text1"/>
+          <w:lang w:val="en-US"/>
+        </w:rPr>
+        <w:t>indicating</w:t>
+      </w:r>
+      <w:proofErr w:type="gramEnd"/>
+      <w:r>
+        <w:rPr>
+          <w:rFonts w:ascii="Calibri" w:eastAsia="Calibri" w:hAnsi="Calibri" w:cs="Calibri"/>
+          <w:color w:val="000000" w:themeColor="text1"/>
+          <w:lang w:val="en-US"/>
+        </w:rPr>
+        <w:t xml:space="preserve"> there are missing packages</w:t>
       </w:r>
       <w:r>
         <w:rPr>
@@ -1593,7 +1679,25 @@
           <w:color w:val="000000" w:themeColor="text1"/>
           <w:lang w:val="en-US"/>
         </w:rPr>
-        <w:t xml:space="preserve"> control+Enter on your keyboard. </w:t>
+        <w:t xml:space="preserve"> </w:t>
+      </w:r>
+      <w:proofErr w:type="spellStart"/>
+      <w:r>
+        <w:rPr>
+          <w:rFonts w:ascii="Calibri" w:eastAsia="Calibri" w:hAnsi="Calibri" w:cs="Calibri"/>
+          <w:color w:val="000000" w:themeColor="text1"/>
+          <w:lang w:val="en-US"/>
+        </w:rPr>
+        <w:t>control+Enter</w:t>
+      </w:r>
+      <w:proofErr w:type="spellEnd"/>
+      <w:r>
+        <w:rPr>
+          <w:rFonts w:ascii="Calibri" w:eastAsia="Calibri" w:hAnsi="Calibri" w:cs="Calibri"/>
+          <w:color w:val="000000" w:themeColor="text1"/>
+          <w:lang w:val="en-US"/>
+        </w:rPr>
+        <w:t xml:space="preserve"> on your keyboard. </w:t>
       </w:r>
     </w:p>
     <w:p>
@@ -1689,7 +1793,25 @@
           <w:color w:val="000000" w:themeColor="text1"/>
           <w:lang w:val="en-US"/>
         </w:rPr>
-        <w:t>If you get errors about packages install them manually by going to the bottom right panel, selecting the Packages tab and clicking install. There type in the name(s) of missing packages and repeat steps 10a and 10b.</w:t>
+        <w:t xml:space="preserve">If you get errors about packages install them manually by going to the bottom right panel, selecting the Packages </w:t>
+      </w:r>
+      <w:proofErr w:type="gramStart"/>
+      <w:r>
+        <w:rPr>
+          <w:rFonts w:ascii="Calibri" w:eastAsia="Calibri" w:hAnsi="Calibri" w:cs="Calibri"/>
+          <w:color w:val="000000" w:themeColor="text1"/>
+          <w:lang w:val="en-US"/>
+        </w:rPr>
+        <w:t>tab</w:t>
+      </w:r>
+      <w:proofErr w:type="gramEnd"/>
+      <w:r>
+        <w:rPr>
+          <w:rFonts w:ascii="Calibri" w:eastAsia="Calibri" w:hAnsi="Calibri" w:cs="Calibri"/>
+          <w:color w:val="000000" w:themeColor="text1"/>
+          <w:lang w:val="en-US"/>
+        </w:rPr>
+        <w:t xml:space="preserve"> and clicking install. There type in the name(s) of missing packages and repeat steps 10a and 10b.</w:t>
       </w:r>
     </w:p>
     <w:p>
@@ -1720,13 +1842,23 @@
         </w:rPr>
         <w:t xml:space="preserve">package </w:t>
       </w:r>
-      <w:r>
-        <w:rPr>
-          <w:rFonts w:ascii="Calibri" w:eastAsia="Calibri" w:hAnsi="Calibri" w:cs="Calibri"/>
-          <w:color w:val="000000" w:themeColor="text1"/>
-          <w:lang w:val="en-US"/>
-        </w:rPr>
-        <w:t>installations you are asked the following</w:t>
+      <w:proofErr w:type="gramStart"/>
+      <w:r>
+        <w:rPr>
+          <w:rFonts w:ascii="Calibri" w:eastAsia="Calibri" w:hAnsi="Calibri" w:cs="Calibri"/>
+          <w:color w:val="000000" w:themeColor="text1"/>
+          <w:lang w:val="en-US"/>
+        </w:rPr>
+        <w:t>installations</w:t>
+      </w:r>
+      <w:proofErr w:type="gramEnd"/>
+      <w:r>
+        <w:rPr>
+          <w:rFonts w:ascii="Calibri" w:eastAsia="Calibri" w:hAnsi="Calibri" w:cs="Calibri"/>
+          <w:color w:val="000000" w:themeColor="text1"/>
+          <w:lang w:val="en-US"/>
+        </w:rPr>
+        <w:t xml:space="preserve"> you are asked the following</w:t>
       </w:r>
     </w:p>
     <w:p>
@@ -1915,7 +2047,139 @@
           <w:szCs w:val="14"/>
           <w:lang w:val="en-US"/>
         </w:rPr>
-        <w:t xml:space="preserve">Warning in file.copy(lp, dirname(pkgdir), recursive = TRUE, copy.date = TRUE) : </w:t>
+        <w:t xml:space="preserve">Warning in </w:t>
+      </w:r>
+      <w:proofErr w:type="spellStart"/>
+      <w:proofErr w:type="gramStart"/>
+      <w:r>
+        <w:rPr>
+          <w:rFonts w:ascii="Calibri" w:eastAsia="Calibri" w:hAnsi="Calibri" w:cs="Calibri"/>
+          <w:i/>
+          <w:iCs/>
+          <w:color w:val="FF0000"/>
+          <w:sz w:val="14"/>
+          <w:szCs w:val="14"/>
+          <w:lang w:val="en-US"/>
+        </w:rPr>
+        <w:t>file.copy</w:t>
+      </w:r>
+      <w:proofErr w:type="spellEnd"/>
+      <w:proofErr w:type="gramEnd"/>
+      <w:r>
+        <w:rPr>
+          <w:rFonts w:ascii="Calibri" w:eastAsia="Calibri" w:hAnsi="Calibri" w:cs="Calibri"/>
+          <w:i/>
+          <w:iCs/>
+          <w:color w:val="FF0000"/>
+          <w:sz w:val="14"/>
+          <w:szCs w:val="14"/>
+          <w:lang w:val="en-US"/>
+        </w:rPr>
+        <w:t>(</w:t>
+      </w:r>
+      <w:proofErr w:type="spellStart"/>
+      <w:r>
+        <w:rPr>
+          <w:rFonts w:ascii="Calibri" w:eastAsia="Calibri" w:hAnsi="Calibri" w:cs="Calibri"/>
+          <w:i/>
+          <w:iCs/>
+          <w:color w:val="FF0000"/>
+          <w:sz w:val="14"/>
+          <w:szCs w:val="14"/>
+          <w:lang w:val="en-US"/>
+        </w:rPr>
+        <w:t>lp</w:t>
+      </w:r>
+      <w:proofErr w:type="spellEnd"/>
+      <w:r>
+        <w:rPr>
+          <w:rFonts w:ascii="Calibri" w:eastAsia="Calibri" w:hAnsi="Calibri" w:cs="Calibri"/>
+          <w:i/>
+          <w:iCs/>
+          <w:color w:val="FF0000"/>
+          <w:sz w:val="14"/>
+          <w:szCs w:val="14"/>
+          <w:lang w:val="en-US"/>
+        </w:rPr>
+        <w:t xml:space="preserve">, </w:t>
+      </w:r>
+      <w:proofErr w:type="spellStart"/>
+      <w:r>
+        <w:rPr>
+          <w:rFonts w:ascii="Calibri" w:eastAsia="Calibri" w:hAnsi="Calibri" w:cs="Calibri"/>
+          <w:i/>
+          <w:iCs/>
+          <w:color w:val="FF0000"/>
+          <w:sz w:val="14"/>
+          <w:szCs w:val="14"/>
+          <w:lang w:val="en-US"/>
+        </w:rPr>
+        <w:t>dirname</w:t>
+      </w:r>
+      <w:proofErr w:type="spellEnd"/>
+      <w:r>
+        <w:rPr>
+          <w:rFonts w:ascii="Calibri" w:eastAsia="Calibri" w:hAnsi="Calibri" w:cs="Calibri"/>
+          <w:i/>
+          <w:iCs/>
+          <w:color w:val="FF0000"/>
+          <w:sz w:val="14"/>
+          <w:szCs w:val="14"/>
+          <w:lang w:val="en-US"/>
+        </w:rPr>
+        <w:t>(</w:t>
+      </w:r>
+      <w:proofErr w:type="spellStart"/>
+      <w:r>
+        <w:rPr>
+          <w:rFonts w:ascii="Calibri" w:eastAsia="Calibri" w:hAnsi="Calibri" w:cs="Calibri"/>
+          <w:i/>
+          <w:iCs/>
+          <w:color w:val="FF0000"/>
+          <w:sz w:val="14"/>
+          <w:szCs w:val="14"/>
+          <w:lang w:val="en-US"/>
+        </w:rPr>
+        <w:t>pkgdir</w:t>
+      </w:r>
+      <w:proofErr w:type="spellEnd"/>
+      <w:r>
+        <w:rPr>
+          <w:rFonts w:ascii="Calibri" w:eastAsia="Calibri" w:hAnsi="Calibri" w:cs="Calibri"/>
+          <w:i/>
+          <w:iCs/>
+          <w:color w:val="FF0000"/>
+          <w:sz w:val="14"/>
+          <w:szCs w:val="14"/>
+          <w:lang w:val="en-US"/>
+        </w:rPr>
+        <w:t xml:space="preserve">), recursive = TRUE, </w:t>
+      </w:r>
+      <w:proofErr w:type="spellStart"/>
+      <w:r>
+        <w:rPr>
+          <w:rFonts w:ascii="Calibri" w:eastAsia="Calibri" w:hAnsi="Calibri" w:cs="Calibri"/>
+          <w:i/>
+          <w:iCs/>
+          <w:color w:val="FF0000"/>
+          <w:sz w:val="14"/>
+          <w:szCs w:val="14"/>
+          <w:lang w:val="en-US"/>
+        </w:rPr>
+        <w:t>copy.date</w:t>
+      </w:r>
+      <w:proofErr w:type="spellEnd"/>
+      <w:r>
+        <w:rPr>
+          <w:rFonts w:ascii="Calibri" w:eastAsia="Calibri" w:hAnsi="Calibri" w:cs="Calibri"/>
+          <w:i/>
+          <w:iCs/>
+          <w:color w:val="FF0000"/>
+          <w:sz w:val="14"/>
+          <w:szCs w:val="14"/>
+          <w:lang w:val="en-US"/>
+        </w:rPr>
+        <w:t xml:space="preserve"> = TRUE) : </w:t>
       </w:r>
     </w:p>
     <w:p>
@@ -1994,7 +2258,43 @@
           <w:color w:val="000000" w:themeColor="text1"/>
           <w:lang w:val="en-US"/>
         </w:rPr>
-        <w:t>go to the bottom right panel, locate under the packages tab the problematic package and click on the X mark that is in the circle at the far right of the row. Select to uninstall the package and then re-install it using step 10c but this time select Yes to restarting R</w:t>
+        <w:t xml:space="preserve">go to the bottom right panel, locate under the packages tab the problematic </w:t>
+      </w:r>
+      <w:proofErr w:type="gramStart"/>
+      <w:r>
+        <w:rPr>
+          <w:rFonts w:ascii="Calibri" w:eastAsia="Calibri" w:hAnsi="Calibri" w:cs="Calibri"/>
+          <w:color w:val="000000" w:themeColor="text1"/>
+          <w:lang w:val="en-US"/>
+        </w:rPr>
+        <w:t>package</w:t>
+      </w:r>
+      <w:proofErr w:type="gramEnd"/>
+      <w:r>
+        <w:rPr>
+          <w:rFonts w:ascii="Calibri" w:eastAsia="Calibri" w:hAnsi="Calibri" w:cs="Calibri"/>
+          <w:color w:val="000000" w:themeColor="text1"/>
+          <w:lang w:val="en-US"/>
+        </w:rPr>
+        <w:t xml:space="preserve"> and click on the X mark that is in the circle at the far right of the row. Select to uninstall the package and then re-install it using step </w:t>
+      </w:r>
+      <w:proofErr w:type="gramStart"/>
+      <w:r>
+        <w:rPr>
+          <w:rFonts w:ascii="Calibri" w:eastAsia="Calibri" w:hAnsi="Calibri" w:cs="Calibri"/>
+          <w:color w:val="000000" w:themeColor="text1"/>
+          <w:lang w:val="en-US"/>
+        </w:rPr>
+        <w:t>10c</w:t>
+      </w:r>
+      <w:proofErr w:type="gramEnd"/>
+      <w:r>
+        <w:rPr>
+          <w:rFonts w:ascii="Calibri" w:eastAsia="Calibri" w:hAnsi="Calibri" w:cs="Calibri"/>
+          <w:color w:val="000000" w:themeColor="text1"/>
+          <w:lang w:val="en-US"/>
+        </w:rPr>
+        <w:t xml:space="preserve"> but this time select Yes to restarting R</w:t>
       </w:r>
     </w:p>
     <w:p>
@@ -2118,7 +2418,15 @@
     <w:p/>
     <w:p>
       <w:r>
-        <w:t xml:space="preserve">The user is required to open the SailingOrdersDFN.Rmd file in administrator mode in R-Studio. Renaming of the file name is not allowed. </w:t>
+        <w:t xml:space="preserve">The user is required to open the </w:t>
+      </w:r>
+      <w:proofErr w:type="spellStart"/>
+      <w:r>
+        <w:t>SailingOrdersDFN.Rmd</w:t>
+      </w:r>
+      <w:proofErr w:type="spellEnd"/>
+      <w:r>
+        <w:t xml:space="preserve"> file in administrator mode in R-Studio. Renaming of the file name is not allowed. </w:t>
       </w:r>
       <w:r>
         <w:t>Once opened, the user should click on the icon looking like an “A” (Switch to visual markdown editor).</w:t>
@@ -2228,7 +2536,15 @@
     </w:p>
     <w:p>
       <w:r>
-        <w:t>In the _tables folder, the user is to open the excel file before rendering the SailingOrders document and included the info required in each sheet. Renaming of the file name or the sheets is not allowed</w:t>
+        <w:t xml:space="preserve">In the _tables folder, the user is to open the excel file before rendering the </w:t>
+      </w:r>
+      <w:proofErr w:type="spellStart"/>
+      <w:r>
+        <w:t>SailingOrders</w:t>
+      </w:r>
+      <w:proofErr w:type="spellEnd"/>
+      <w:r>
+        <w:t xml:space="preserve"> document and included the info required in each sheet. Renaming of the file name or the sheets is not allowed</w:t>
       </w:r>
       <w:r>
         <w:t>, but additional sheets can be added</w:t>
@@ -2345,7 +2661,15 @@
         </w:numPr>
       </w:pPr>
       <w:r>
-        <w:t>The text part in the “SailingOrdersDFN.Rmd” file is updated to the extent possible.</w:t>
+        <w:t>The text part in the “</w:t>
+      </w:r>
+      <w:proofErr w:type="spellStart"/>
+      <w:r>
+        <w:t>SailingOrdersDFN.Rmd</w:t>
+      </w:r>
+      <w:proofErr w:type="spellEnd"/>
+      <w:r>
+        <w:t>” file is updated to the extent possible.</w:t>
       </w:r>
     </w:p>
     <w:p>
@@ -2360,7 +2684,23 @@
           <w:i/>
           <w:iCs/>
         </w:rPr>
-        <w:t>Note: The provided “SailingOrdersDFN.proj” contains all the necessary elements to compile a final version of Sailing Orders for a survey. However, the information rendered applies only to that specific survey.</w:t>
+        <w:t>Note: The provided “</w:t>
+      </w:r>
+      <w:proofErr w:type="spellStart"/>
+      <w:r>
+        <w:rPr>
+          <w:i/>
+          <w:iCs/>
+        </w:rPr>
+        <w:t>SailingOrdersDFN.proj</w:t>
+      </w:r>
+      <w:proofErr w:type="spellEnd"/>
+      <w:r>
+        <w:rPr>
+          <w:i/>
+          <w:iCs/>
+        </w:rPr>
+        <w:t>” contains all the necessary elements to compile a final version of Sailing Orders for a survey. However, the information rendered applies only to that specific survey.</w:t>
       </w:r>
     </w:p>
     <w:p>
@@ -2379,16 +2719,26 @@
       <w:r>
         <w:t>For each of the non-captions suffix sheets, a caption for the tables is required to be included in the “</w:t>
       </w:r>
-      <w:r>
-        <w:t>tab.captions</w:t>
-      </w:r>
+      <w:proofErr w:type="spellStart"/>
+      <w:r>
+        <w:t>tab_captions</w:t>
+      </w:r>
+      <w:proofErr w:type="spellEnd"/>
       <w:r>
         <w:t xml:space="preserve">” sheet. </w:t>
       </w:r>
     </w:p>
     <w:p>
       <w:r>
-        <w:t>If specific formatting is required for elements of the various tables the user can do it either in the Excel file using specific rules or do it manually every time that the output document will be compiled</w:t>
+        <w:t xml:space="preserve">If specific formatting is required for elements of the various </w:t>
+      </w:r>
+      <w:proofErr w:type="gramStart"/>
+      <w:r>
+        <w:t>tables</w:t>
+      </w:r>
+      <w:proofErr w:type="gramEnd"/>
+      <w:r>
+        <w:t xml:space="preserve"> the user can do it either in the Excel file using specific rules or do it manually every time that the output document will be compiled</w:t>
       </w:r>
       <w:r>
         <w:t>.</w:t>
@@ -2409,7 +2759,21 @@
         <w:rPr>
           <w:lang w:val="en-US"/>
         </w:rPr>
-        <w:t>Inclusion of text with specific font face should be done in the input_text according to the following:</w:t>
+        <w:t xml:space="preserve">Inclusion of text with specific font face should be done in the </w:t>
+      </w:r>
+      <w:proofErr w:type="spellStart"/>
+      <w:r>
+        <w:rPr>
+          <w:lang w:val="en-US"/>
+        </w:rPr>
+        <w:t>input_text</w:t>
+      </w:r>
+      <w:proofErr w:type="spellEnd"/>
+      <w:r>
+        <w:rPr>
+          <w:lang w:val="en-US"/>
+        </w:rPr>
+        <w:t xml:space="preserve"> according to the following:</w:t>
       </w:r>
     </w:p>
     <w:p>
@@ -2439,7 +2803,21 @@
         <w:rPr>
           <w:lang w:val="en-US"/>
         </w:rPr>
-        <w:t xml:space="preserve">, e.g. </w:t>
+        <w:t xml:space="preserve">, </w:t>
+      </w:r>
+      <w:proofErr w:type="gramStart"/>
+      <w:r>
+        <w:rPr>
+          <w:lang w:val="en-US"/>
+        </w:rPr>
+        <w:t>e.g.</w:t>
+      </w:r>
+      <w:proofErr w:type="gramEnd"/>
+      <w:r>
+        <w:rPr>
+          <w:lang w:val="en-US"/>
+        </w:rPr>
+        <w:t xml:space="preserve"> </w:t>
       </w:r>
       <w:r>
         <w:rPr>
@@ -2492,7 +2870,21 @@
         <w:rPr>
           <w:lang w:val="en-US"/>
         </w:rPr>
-        <w:t xml:space="preserve">For text to appear in bold surround the word with double asterisks, e.g. **bold** will be in the output </w:t>
+        <w:t xml:space="preserve">For text to appear in bold surround the word with double asterisks, </w:t>
+      </w:r>
+      <w:proofErr w:type="gramStart"/>
+      <w:r>
+        <w:rPr>
+          <w:lang w:val="en-US"/>
+        </w:rPr>
+        <w:t>e.g.</w:t>
+      </w:r>
+      <w:proofErr w:type="gramEnd"/>
+      <w:r>
+        <w:rPr>
+          <w:lang w:val="en-US"/>
+        </w:rPr>
+        <w:t xml:space="preserve"> **bold** will be in the output </w:t>
       </w:r>
       <w:r>
         <w:rPr>
@@ -2680,13 +3072,41 @@
         <w:rPr>
           <w:lang w:val="en-US"/>
         </w:rPr>
-        <w:t>, in the cell that the footnote applies the following without the quotes “^[footnote text]”</w:t>
-      </w:r>
-      <w:r>
-        <w:rPr>
-          <w:lang w:val="en-US"/>
-        </w:rPr>
-        <w:t>. More footnotes (e.g. 1, 2, 3) will appear automatically as long as the user adds additional notations as the one shown in the square brackets above.</w:t>
+        <w:t>, in the cell that the footnote applies the following without the quotes “</w:t>
+      </w:r>
+      <w:proofErr w:type="gramStart"/>
+      <w:r>
+        <w:rPr>
+          <w:lang w:val="en-US"/>
+        </w:rPr>
+        <w:t>^[</w:t>
+      </w:r>
+      <w:proofErr w:type="gramEnd"/>
+      <w:r>
+        <w:rPr>
+          <w:lang w:val="en-US"/>
+        </w:rPr>
+        <w:t>footnote text]”</w:t>
+      </w:r>
+      <w:r>
+        <w:rPr>
+          <w:lang w:val="en-US"/>
+        </w:rPr>
+        <w:t>. More footnotes (</w:t>
+      </w:r>
+      <w:proofErr w:type="gramStart"/>
+      <w:r>
+        <w:rPr>
+          <w:lang w:val="en-US"/>
+        </w:rPr>
+        <w:t>e.g.</w:t>
+      </w:r>
+      <w:proofErr w:type="gramEnd"/>
+      <w:r>
+        <w:rPr>
+          <w:lang w:val="en-US"/>
+        </w:rPr>
+        <w:t xml:space="preserve"> 1, 2, 3) will appear automatically as long as the user adds additional notations as the one shown in the square brackets above.</w:t>
       </w:r>
     </w:p>
     <w:p>
@@ -2718,7 +3138,29 @@
         <w:t xml:space="preserve">” sheets. The tidier and plainer a table is, the rendering will be the intended one. </w:t>
       </w:r>
       <w:r>
-        <w:t>In some cases, additional columns can be added if required, but this is table-dependent. In the reqparttab columns A, B and C are not to be renamed</w:t>
+        <w:t>In some cases, additional columns can be added if required, but this is table-</w:t>
+      </w:r>
+      <w:proofErr w:type="spellStart"/>
+      <w:r>
+        <w:t>dependen</w:t>
+      </w:r>
+      <w:r>
+        <w:t>d</w:t>
+      </w:r>
+      <w:proofErr w:type="spellEnd"/>
+      <w:r>
+        <w:t xml:space="preserve">. In the </w:t>
+      </w:r>
+      <w:proofErr w:type="spellStart"/>
+      <w:r>
+        <w:t>reqparttab</w:t>
+      </w:r>
+      <w:proofErr w:type="spellEnd"/>
+      <w:r>
+        <w:t xml:space="preserve"> columns A, B and C are not to be renamed</w:t>
+      </w:r>
+      <w:r>
+        <w:t xml:space="preserve">. </w:t>
       </w:r>
       <w:r>
         <w:t>If complicated table structures are required and inevitable, contact Piera Carpi or Nikos Nikolioudakis.</w:t>
@@ -2733,17 +3175,33 @@
         <w:t>For step (B)</w:t>
       </w:r>
       <w:r>
-        <w:t xml:space="preserve">, under the _images folder, the user can include all images that are expected to be rendered in the output document. Renaming of the folder name is not allowed. Change of file names of images is permitted (but see further down for instructions). Preferential image format is .png or .jpeg. The code might need to be adjusted accordingly if .jpeg images are included. Once the user has placed the images in the folder, correspondence must be ensured between the file names of the </w:t>
+        <w:t>, under the _images folder, the user can include all images that are expected to be rendered in the output document. Renaming of the folder name is not allowed. Change of file names of images is permitted (but see further down for instructions). Preferential image format is .</w:t>
+      </w:r>
+      <w:proofErr w:type="spellStart"/>
+      <w:r>
+        <w:t>png</w:t>
+      </w:r>
+      <w:proofErr w:type="spellEnd"/>
+      <w:r>
+        <w:t xml:space="preserve"> or .jpeg. The code might need to be adjusted accordingly if .jpeg images are included. Once the user </w:t>
       </w:r>
       <w:r>
         <w:lastRenderedPageBreak/>
-        <w:t>images and what is listed in the “fig</w:t>
+        <w:t>has placed the images in the folder, correspondence must be ensured between the file names of the images and what is listed in the “</w:t>
+      </w:r>
+      <w:proofErr w:type="spellStart"/>
+      <w:r>
+        <w:t>fig</w:t>
       </w:r>
       <w:r>
         <w:t>_</w:t>
       </w:r>
       <w:r>
-        <w:t>captions” sheet of the “</w:t>
+        <w:t>captions</w:t>
+      </w:r>
+      <w:proofErr w:type="spellEnd"/>
+      <w:r>
+        <w:t>” sheet of the “</w:t>
       </w:r>
       <w:r>
         <w:t>input_dataframes.xlsx</w:t>
@@ -2780,9 +3238,11 @@
       <w:r>
         <w:t>“</w:t>
       </w:r>
+      <w:proofErr w:type="spellStart"/>
       <w:r>
         <w:t>SailingOrdersDFN.Rmd</w:t>
       </w:r>
+      <w:proofErr w:type="spellEnd"/>
       <w:r>
         <w:t>”</w:t>
       </w:r>
@@ -2897,7 +3357,30 @@
     </w:p>
     <w:p>
       <w:r>
-        <w:t xml:space="preserve">If steps A, B and C have been carried out correctly, the user needs to expand the “Knit” menu and select the Knit to rodxc_document option. The document will compile and open in MS Word once rendering is completed. The </w:t>
+        <w:t xml:space="preserve">If steps A, B and C have been carried out correctly, the user needs to expand the “Knit” menu and select the Knit to </w:t>
+      </w:r>
+      <w:proofErr w:type="spellStart"/>
+      <w:r>
+        <w:t>rodxc_document</w:t>
+      </w:r>
+      <w:proofErr w:type="spellEnd"/>
+      <w:r>
+        <w:t xml:space="preserve"> option. </w:t>
+      </w:r>
+      <w:r>
+        <w:t xml:space="preserve">Before this, ensure that </w:t>
+      </w:r>
+      <w:r>
+        <w:rPr>
+          <w:u w:val="single"/>
+        </w:rPr>
+        <w:t>you do not have</w:t>
+      </w:r>
+      <w:r>
+        <w:t xml:space="preserve"> the input_dataframes.xlsx file open in your Excel. </w:t>
+      </w:r>
+      <w:r>
+        <w:t xml:space="preserve">The document will compile and open in MS Word once rendering is completed. The </w:t>
       </w:r>
       <w:r>
         <w:t>location of the “</w:t>
@@ -2906,7 +3389,20 @@
         <w:t>SailingOrdersDFN.doc</w:t>
       </w:r>
       <w:r>
-        <w:t xml:space="preserve">x” is in the .Rproj directory. </w:t>
+        <w:t xml:space="preserve">x” is in </w:t>
+      </w:r>
+      <w:proofErr w:type="gramStart"/>
+      <w:r>
+        <w:t>the .</w:t>
+      </w:r>
+      <w:proofErr w:type="spellStart"/>
+      <w:r>
+        <w:t>Rproj</w:t>
+      </w:r>
+      <w:proofErr w:type="spellEnd"/>
+      <w:proofErr w:type="gramEnd"/>
+      <w:r>
+        <w:t xml:space="preserve"> directory. </w:t>
       </w:r>
     </w:p>
     <w:p>
@@ -2954,7 +3450,15 @@
     <w:p/>
     <w:p>
       <w:r>
-        <w:t>At this point, the draft Sailing Orders can be shared with the pre-survey meeting participants or any other person involved</w:t>
+        <w:t xml:space="preserve">At this point, the draft Sailing Orders can be shared with the pre-survey meeting </w:t>
+      </w:r>
+      <w:proofErr w:type="gramStart"/>
+      <w:r>
+        <w:t>participants</w:t>
+      </w:r>
+      <w:proofErr w:type="gramEnd"/>
+      <w:r>
+        <w:t xml:space="preserve"> or any other person involved</w:t>
       </w:r>
       <w:r>
         <w:t xml:space="preserve">, as a .docx. </w:t>
@@ -2997,7 +3501,15 @@
         <w:t xml:space="preserve"> </w:t>
       </w:r>
       <w:r>
-        <w:t xml:space="preserve">needs to be included in the “SailingOrdersDFN.Rmd” file and recompiled. </w:t>
+        <w:t>needs to be included in the “</w:t>
+      </w:r>
+      <w:proofErr w:type="spellStart"/>
+      <w:r>
+        <w:t>SailingOrdersDFN.Rmd</w:t>
+      </w:r>
+      <w:proofErr w:type="spellEnd"/>
+      <w:r>
+        <w:t xml:space="preserve">” file and recompiled. </w:t>
       </w:r>
     </w:p>
     <w:p>
@@ -3030,7 +3542,6 @@
     <w:p/>
     <w:p>
       <w:r>
-        <w:lastRenderedPageBreak/>
         <w:br w:type="page"/>
       </w:r>
     </w:p>
@@ -3074,7 +3585,23 @@
         <w:t>atchsamplingworkflow.pptx</w:t>
       </w:r>
       <w:r>
-        <w:t>”. This .pptx is to be modified accordingly during the pre-survey meeting and once finalized it should be saved in the _images folder as .png with the name “catchsamplingworkflow”.</w:t>
+        <w:t>”. This .pptx is to be modified accordingly during the pre-survey meeting and once finalized it should be saved in the _images folder as .</w:t>
+      </w:r>
+      <w:proofErr w:type="spellStart"/>
+      <w:r>
+        <w:t>png</w:t>
+      </w:r>
+      <w:proofErr w:type="spellEnd"/>
+      <w:r>
+        <w:t xml:space="preserve"> with the name “</w:t>
+      </w:r>
+      <w:proofErr w:type="spellStart"/>
+      <w:r>
+        <w:t>catchsamplingworkflow</w:t>
+      </w:r>
+      <w:proofErr w:type="spellEnd"/>
+      <w:r>
+        <w:t>”.</w:t>
       </w:r>
     </w:p>
     <w:p>
@@ -3094,7 +3621,25 @@
         </w:rPr>
       </w:pPr>
       <w:r>
-        <w:t>The output image size is controlled from within the code chunks, through the arguments fig.width and fig.height. The user should modify the images accordingly to achieve the expected output. Note: Image sizes for images that are standard for each survey should not be tampered with, as the set values provide an acceptable output.</w:t>
+        <w:t xml:space="preserve">The output image size is controlled from within the code chunks, through the arguments </w:t>
+      </w:r>
+      <w:proofErr w:type="spellStart"/>
+      <w:proofErr w:type="gramStart"/>
+      <w:r>
+        <w:t>fig.width</w:t>
+      </w:r>
+      <w:proofErr w:type="spellEnd"/>
+      <w:proofErr w:type="gramEnd"/>
+      <w:r>
+        <w:t xml:space="preserve"> and </w:t>
+      </w:r>
+      <w:proofErr w:type="spellStart"/>
+      <w:r>
+        <w:t>fig.height</w:t>
+      </w:r>
+      <w:proofErr w:type="spellEnd"/>
+      <w:r>
+        <w:t>. The user should modify the images accordingly to achieve the expected output. Note: Image sizes for images that are standard for each survey should not be tampered with, as the set values provide an acceptable output.</w:t>
       </w:r>
     </w:p>
     <w:p>
@@ -3109,7 +3654,15 @@
     </w:p>
     <w:p>
       <w:r>
-        <w:t xml:space="preserve">If the user needs to change the orientation of a section this is achievable by using the following </w:t>
+        <w:t xml:space="preserve">If the user needs to change the orientation of a </w:t>
+      </w:r>
+      <w:proofErr w:type="gramStart"/>
+      <w:r>
+        <w:t>section</w:t>
+      </w:r>
+      <w:proofErr w:type="gramEnd"/>
+      <w:r>
+        <w:t xml:space="preserve"> this is achievable by using the following </w:t>
       </w:r>
       <w:r>
         <w:t xml:space="preserve">red highlighted </w:t>
@@ -3126,11 +3679,19 @@
       <w:r>
         <w:br/>
       </w:r>
+      <w:proofErr w:type="gramStart"/>
       <w:r>
         <w:rPr>
           <w:color w:val="FF0000"/>
         </w:rPr>
-        <w:t>&lt;!---BLOCK_LANDSCAPE_START---&gt;</w:t>
+        <w:t>&lt;!---</w:t>
+      </w:r>
+      <w:proofErr w:type="gramEnd"/>
+      <w:r>
+        <w:rPr>
+          <w:color w:val="FF0000"/>
+        </w:rPr>
+        <w:t>BLOCK_LANDSCAPE_START---&gt;</w:t>
       </w:r>
     </w:p>
     <w:p>
@@ -3154,11 +3715,19 @@
           <w:color w:val="FF0000"/>
         </w:rPr>
       </w:pPr>
+      <w:proofErr w:type="gramStart"/>
       <w:r>
         <w:rPr>
           <w:color w:val="FF0000"/>
         </w:rPr>
-        <w:t>&lt;!---BLOCK_LANDSCAPE_STOP---&gt;</w:t>
+        <w:t>&lt;!---</w:t>
+      </w:r>
+      <w:proofErr w:type="gramEnd"/>
+      <w:r>
+        <w:rPr>
+          <w:color w:val="FF0000"/>
+        </w:rPr>
+        <w:t>BLOCK_LANDSCAPE_STOP---&gt;</w:t>
       </w:r>
     </w:p>
     <w:p/>
@@ -3201,7 +3770,23 @@
         <w:t>input_dataframes.xlsx</w:t>
       </w:r>
       <w:r>
-        <w:t>”. Name it using a similar pattern to the existing tables, e.g. “taxonomytab”. The “SO” prefix is to indicate that the table belongs to the Sailing Orders and the “tab” part, that it is a table to be included.</w:t>
+        <w:t xml:space="preserve">”. Name it </w:t>
+      </w:r>
+      <w:proofErr w:type="gramStart"/>
+      <w:r>
+        <w:t>using</w:t>
+      </w:r>
+      <w:proofErr w:type="gramEnd"/>
+      <w:r>
+        <w:t xml:space="preserve"> a similar pattern to the existing tables, e.g. “</w:t>
+      </w:r>
+      <w:proofErr w:type="spellStart"/>
+      <w:r>
+        <w:t>taxonomytab</w:t>
+      </w:r>
+      <w:proofErr w:type="spellEnd"/>
+      <w:r>
+        <w:t>”. The “SO” prefix is to indicate that the table belongs to the Sailing Orders and the “tab” part, that it is a table to be included.</w:t>
       </w:r>
     </w:p>
     <w:p>
@@ -3215,9 +3800,11 @@
       <w:r>
         <w:t>In the “</w:t>
       </w:r>
+      <w:proofErr w:type="spellStart"/>
       <w:r>
         <w:t>tab_captions</w:t>
       </w:r>
+      <w:proofErr w:type="spellEnd"/>
       <w:r>
         <w:t>” sheet, add under the tab.name column the name of the sheet you created in step 1 and provide a caption under the caption column.</w:t>
       </w:r>
@@ -3231,7 +3818,15 @@
         </w:numPr>
       </w:pPr>
       <w:r>
-        <w:t xml:space="preserve">Open the “SailingOrdersDFN.Rmd” file with the process described in </w:t>
+        <w:t>Open the “</w:t>
+      </w:r>
+      <w:proofErr w:type="spellStart"/>
+      <w:r>
+        <w:t>SailingOrdersDFN.Rmd</w:t>
+      </w:r>
+      <w:proofErr w:type="spellEnd"/>
+      <w:r>
+        <w:t xml:space="preserve">” file with the process described in </w:t>
       </w:r>
       <w:r>
         <w:rPr>
@@ -3253,11 +3848,21 @@
         </w:numPr>
       </w:pPr>
       <w:r>
-        <w:t>Let’s assume that you want to include the new table that you created in step 1 under “ANNEX V. Survey-specific additional sampling” location. Find any other table code chunk, e.g. the table “</w:t>
-      </w:r>
+        <w:t xml:space="preserve">Let’s assume that you want to include the new table that you created in step 1 under “ANNEX V. Survey-specific additional sampling” location. Find any other table code chunk, </w:t>
+      </w:r>
+      <w:proofErr w:type="gramStart"/>
+      <w:r>
+        <w:t>e.g.</w:t>
+      </w:r>
+      <w:proofErr w:type="gramEnd"/>
+      <w:r>
+        <w:t xml:space="preserve"> the table “</w:t>
+      </w:r>
+      <w:proofErr w:type="spellStart"/>
       <w:r>
         <w:t>equipmenttab</w:t>
       </w:r>
+      <w:proofErr w:type="spellEnd"/>
       <w:r>
         <w:t xml:space="preserve">” of ANNEX VI. </w:t>
       </w:r>
@@ -3271,7 +3876,23 @@
         </w:numPr>
       </w:pPr>
       <w:r>
-        <w:t>Copy the table code chunk by selecting it and copying it with Ctrl+C . The code chunk is looking like this:</w:t>
+        <w:t xml:space="preserve">Copy the table code chunk by selecting it and copying it with </w:t>
+      </w:r>
+      <w:proofErr w:type="spellStart"/>
+      <w:r>
+        <w:t>Ctrl+</w:t>
+      </w:r>
+      <w:proofErr w:type="gramStart"/>
+      <w:r>
+        <w:t>C</w:t>
+      </w:r>
+      <w:proofErr w:type="spellEnd"/>
+      <w:r>
+        <w:t xml:space="preserve"> .</w:t>
+      </w:r>
+      <w:proofErr w:type="gramEnd"/>
+      <w:r>
+        <w:t xml:space="preserve"> The code chunk is looking like this:</w:t>
       </w:r>
     </w:p>
     <w:p>
@@ -3332,7 +3953,23 @@
         </w:numPr>
       </w:pPr>
       <w:r>
-        <w:t xml:space="preserve">Once copied, place your cursor before the “\newpage” and paste (Ctrl+V). The copied code chunk will be placed there. </w:t>
+        <w:t>Once copied, place your cursor before the “\</w:t>
+      </w:r>
+      <w:proofErr w:type="spellStart"/>
+      <w:r>
+        <w:t>newpage</w:t>
+      </w:r>
+      <w:proofErr w:type="spellEnd"/>
+      <w:r>
+        <w:t>” and paste (</w:t>
+      </w:r>
+      <w:proofErr w:type="spellStart"/>
+      <w:r>
+        <w:t>Ctrl+V</w:t>
+      </w:r>
+      <w:proofErr w:type="spellEnd"/>
+      <w:r>
+        <w:t xml:space="preserve">). The copied code chunk will be placed there. </w:t>
       </w:r>
     </w:p>
     <w:p>
@@ -3346,15 +3983,22 @@
       <w:r>
         <w:t>Now you need to modify the code chunk accordingly. To do this, replace the “</w:t>
       </w:r>
+      <w:proofErr w:type="spellStart"/>
       <w:r>
         <w:t>equipmenttab</w:t>
       </w:r>
-      <w:r>
-        <w:t>” with “taxonomy</w:t>
+      <w:proofErr w:type="spellEnd"/>
+      <w:r>
+        <w:t>” with “</w:t>
+      </w:r>
+      <w:proofErr w:type="spellStart"/>
+      <w:r>
+        <w:t>taxonomy</w:t>
       </w:r>
       <w:r>
         <w:t>tab</w:t>
       </w:r>
+      <w:proofErr w:type="spellEnd"/>
       <w:r>
         <w:t>” in all instances of the code chunk.</w:t>
       </w:r>
@@ -3371,25 +4015,41 @@
         <w:t xml:space="preserve">If a cross-reference to the table is needed somewhere in the text this can be done be adding the notation: </w:t>
       </w:r>
       <w:r>
-        <w:t>Table @ref(tab:</w:t>
+        <w:t>Table @ref(</w:t>
+      </w:r>
+      <w:proofErr w:type="gramStart"/>
+      <w:r>
+        <w:t>tab:</w:t>
       </w:r>
       <w:r>
         <w:t>taxonomy</w:t>
       </w:r>
       <w:r>
-        <w:t>tab)</w:t>
+        <w:t>tab</w:t>
+      </w:r>
+      <w:proofErr w:type="gramEnd"/>
+      <w:r>
+        <w:t>)</w:t>
       </w:r>
       <w:r>
         <w:t xml:space="preserve">. If the table is placed in an Annex, then the notation is slightly modified to: </w:t>
       </w:r>
       <w:r>
-        <w:t>Table @ref(tab:</w:t>
+        <w:t>Table @ref(</w:t>
+      </w:r>
+      <w:proofErr w:type="gramStart"/>
+      <w:r>
+        <w:t>tab:</w:t>
       </w:r>
       <w:r>
         <w:t>taxonomy</w:t>
       </w:r>
       <w:r>
-        <w:t>tab) (ANNEX V)</w:t>
+        <w:t>tab</w:t>
+      </w:r>
+      <w:proofErr w:type="gramEnd"/>
+      <w:r>
+        <w:t>) (ANNEX V)</w:t>
       </w:r>
     </w:p>
     <w:p/>
@@ -3420,7 +4080,31 @@
         </w:numPr>
       </w:pPr>
       <w:r>
-        <w:t>Add a new image in the _images folder of the project. Name it using a similar pattern to the existing images, e.g. “new_imageSOfig”. Preferably, it should be a .png image format. The “SO” prefix is to indicate that the table belongs to the Sailing Orders and the “fig” part, that it is an image to be included.</w:t>
+        <w:t xml:space="preserve">Add a new image in the _images folder of the project. Name it </w:t>
+      </w:r>
+      <w:proofErr w:type="gramStart"/>
+      <w:r>
+        <w:t>using</w:t>
+      </w:r>
+      <w:proofErr w:type="gramEnd"/>
+      <w:r>
+        <w:t xml:space="preserve"> a similar pattern to the existing images, e.g. “</w:t>
+      </w:r>
+      <w:proofErr w:type="spellStart"/>
+      <w:r>
+        <w:t>new_imageSOfig</w:t>
+      </w:r>
+      <w:proofErr w:type="spellEnd"/>
+      <w:r>
+        <w:t>”. Preferably, it should be a .</w:t>
+      </w:r>
+      <w:proofErr w:type="spellStart"/>
+      <w:r>
+        <w:t>png</w:t>
+      </w:r>
+      <w:proofErr w:type="spellEnd"/>
+      <w:r>
+        <w:t xml:space="preserve"> image format. The “SO” prefix is to indicate that the table belongs to the Sailing Orders and the “fig” part, that it is an image to be included.</w:t>
       </w:r>
     </w:p>
     <w:p>
@@ -3432,11 +4116,16 @@
         </w:numPr>
       </w:pPr>
       <w:r>
-        <w:t>In the “fig</w:t>
+        <w:t>In the “</w:t>
+      </w:r>
+      <w:proofErr w:type="spellStart"/>
+      <w:r>
+        <w:t>fig</w:t>
       </w:r>
       <w:r>
         <w:t>_captions</w:t>
       </w:r>
+      <w:proofErr w:type="spellEnd"/>
       <w:r>
         <w:t>” sheet of the “</w:t>
       </w:r>
@@ -3456,7 +4145,15 @@
         </w:numPr>
       </w:pPr>
       <w:r>
-        <w:t xml:space="preserve">Open the “SailingOrdersDFN.Rmd” file with the process described in </w:t>
+        <w:t>Open the “</w:t>
+      </w:r>
+      <w:proofErr w:type="spellStart"/>
+      <w:r>
+        <w:t>SailingOrdersDFN.Rmd</w:t>
+      </w:r>
+      <w:proofErr w:type="spellEnd"/>
+      <w:r>
+        <w:t xml:space="preserve">” file with the process described in </w:t>
       </w:r>
       <w:r>
         <w:rPr>
@@ -3478,13 +4175,29 @@
         </w:numPr>
       </w:pPr>
       <w:r>
-        <w:t>Let’s assume that you want to include the new image that you created in step 1 under “ANNEX V. Survey-specific additional sampling” location. Find any other image code chunk, e.g. the image “surveyareamap</w:t>
+        <w:t xml:space="preserve">Let’s assume that you want to include the new image that you created in step 1 under “ANNEX V. Survey-specific additional sampling” location. Find any other image code chunk, </w:t>
+      </w:r>
+      <w:proofErr w:type="gramStart"/>
+      <w:r>
+        <w:t>e.g.</w:t>
+      </w:r>
+      <w:proofErr w:type="gramEnd"/>
+      <w:r>
+        <w:t xml:space="preserve"> the image “</w:t>
+      </w:r>
+      <w:proofErr w:type="spellStart"/>
+      <w:r>
+        <w:t>surveyareamap</w:t>
       </w:r>
       <w:r>
         <w:t>SO</w:t>
       </w:r>
       <w:r>
-        <w:t xml:space="preserve">fig”. </w:t>
+        <w:t>fig</w:t>
+      </w:r>
+      <w:proofErr w:type="spellEnd"/>
+      <w:r>
+        <w:t xml:space="preserve">”. </w:t>
       </w:r>
     </w:p>
     <w:p>
@@ -3496,7 +4209,23 @@
         </w:numPr>
       </w:pPr>
       <w:r>
-        <w:t>Copy the table code chunk by selecting it and copying it with Ctrl+C . The code chunk is looking like this:</w:t>
+        <w:t xml:space="preserve">Copy the table code chunk by selecting it and copying it with </w:t>
+      </w:r>
+      <w:proofErr w:type="spellStart"/>
+      <w:r>
+        <w:t>Ctrl+</w:t>
+      </w:r>
+      <w:proofErr w:type="gramStart"/>
+      <w:r>
+        <w:t>C</w:t>
+      </w:r>
+      <w:proofErr w:type="spellEnd"/>
+      <w:r>
+        <w:t xml:space="preserve"> .</w:t>
+      </w:r>
+      <w:proofErr w:type="gramEnd"/>
+      <w:r>
+        <w:t xml:space="preserve"> The code chunk is looking like this:</w:t>
       </w:r>
     </w:p>
     <w:p>
@@ -3556,7 +4285,23 @@
         </w:numPr>
       </w:pPr>
       <w:r>
-        <w:t xml:space="preserve">Once copied, place your cursor before the “\newpage” and paste (Ctrl+V). The copied code chunk will be placed there. </w:t>
+        <w:t>Once copied, place your cursor before the “\</w:t>
+      </w:r>
+      <w:proofErr w:type="spellStart"/>
+      <w:r>
+        <w:t>newpage</w:t>
+      </w:r>
+      <w:proofErr w:type="spellEnd"/>
+      <w:r>
+        <w:t>” and paste (</w:t>
+      </w:r>
+      <w:proofErr w:type="spellStart"/>
+      <w:r>
+        <w:t>Ctrl+V</w:t>
+      </w:r>
+      <w:proofErr w:type="spellEnd"/>
+      <w:r>
+        <w:t xml:space="preserve">). The copied code chunk will be placed there. </w:t>
       </w:r>
     </w:p>
     <w:p>
@@ -3568,13 +4313,29 @@
         </w:numPr>
       </w:pPr>
       <w:r>
-        <w:t>Now you need to modify the code chunk accordingly. To do this, replace the “surveyareamap</w:t>
+        <w:t>Now you need to modify the code chunk accordingly. To do this, replace the “</w:t>
+      </w:r>
+      <w:proofErr w:type="spellStart"/>
+      <w:r>
+        <w:t>surveyareamap</w:t>
       </w:r>
       <w:r>
         <w:t>SO</w:t>
       </w:r>
       <w:r>
-        <w:t>fig” with “new_imageSOfig” in all instances of the code chunk.</w:t>
+        <w:t>fig</w:t>
+      </w:r>
+      <w:proofErr w:type="spellEnd"/>
+      <w:r>
+        <w:t>” with “</w:t>
+      </w:r>
+      <w:proofErr w:type="spellStart"/>
+      <w:r>
+        <w:t>new_imageSOfig</w:t>
+      </w:r>
+      <w:proofErr w:type="spellEnd"/>
+      <w:r>
+        <w:t>” in all instances of the code chunk.</w:t>
       </w:r>
     </w:p>
     <w:p>
@@ -3589,13 +4350,29 @@
         <w:t xml:space="preserve">If a cross-reference to the table is needed somewhere in the text this can be done be adding the notation: </w:t>
       </w:r>
       <w:r>
-        <w:t>Figure @ref(fig:surveyareamapSOfig)</w:t>
+        <w:t>Figure @ref(</w:t>
+      </w:r>
+      <w:proofErr w:type="gramStart"/>
+      <w:r>
+        <w:t>fig:surveyareamapSOfig</w:t>
+      </w:r>
+      <w:proofErr w:type="gramEnd"/>
+      <w:r>
+        <w:t>)</w:t>
       </w:r>
       <w:r>
         <w:t xml:space="preserve">. If the image is placed in an Annex, then the notation is slightly modified to: </w:t>
       </w:r>
       <w:r>
-        <w:t>Figure @ref(fig:surveyareamapSOfig)</w:t>
+        <w:t>Figure @ref(</w:t>
+      </w:r>
+      <w:proofErr w:type="gramStart"/>
+      <w:r>
+        <w:t>fig:surveyareamapSOfig</w:t>
+      </w:r>
+      <w:proofErr w:type="gramEnd"/>
+      <w:r>
+        <w:t>)</w:t>
       </w:r>
       <w:r>
         <w:t xml:space="preserve"> (ANNEX V)</w:t>

</xml_diff>

<commit_message>
split to pelagic/demersal rmds plus improvements
</commit_message>
<xml_diff>
--- a/SailingOrdersDFN_User_Manual.docx
+++ b/SailingOrdersDFN_User_Manual.docx
@@ -1415,7 +1415,47 @@
           <w:color w:val="000000" w:themeColor="text1"/>
           <w:lang w:val="en-US"/>
         </w:rPr>
-        <w:t>.Rmd and select it. Once it opens in the top left panel you might get warnings for missing packages like the one below</w:t>
+        <w:t>_pelagic</w:t>
+      </w:r>
+      <w:r>
+        <w:rPr>
+          <w:rFonts w:ascii="Calibri" w:eastAsia="Calibri" w:hAnsi="Calibri" w:cs="Calibri"/>
+          <w:color w:val="000000" w:themeColor="text1"/>
+          <w:lang w:val="en-US"/>
+        </w:rPr>
+        <w:t xml:space="preserve">.Rmd </w:t>
+      </w:r>
+      <w:r>
+        <w:rPr>
+          <w:rFonts w:ascii="Calibri" w:eastAsia="Calibri" w:hAnsi="Calibri" w:cs="Calibri"/>
+          <w:color w:val="000000" w:themeColor="text1"/>
+          <w:lang w:val="en-US"/>
+        </w:rPr>
+        <w:t>or SailingOrdersDFN_demersal</w:t>
+      </w:r>
+      <w:r>
+        <w:rPr>
+          <w:rFonts w:ascii="Calibri" w:eastAsia="Calibri" w:hAnsi="Calibri" w:cs="Calibri"/>
+          <w:color w:val="000000" w:themeColor="text1"/>
+          <w:lang w:val="en-US"/>
+        </w:rPr>
+        <w:t xml:space="preserve">.Rmd </w:t>
+      </w:r>
+      <w:r>
+        <w:rPr>
+          <w:rFonts w:ascii="Calibri" w:eastAsia="Calibri" w:hAnsi="Calibri" w:cs="Calibri"/>
+          <w:color w:val="000000" w:themeColor="text1"/>
+          <w:lang w:val="en-US"/>
+        </w:rPr>
+        <w:t xml:space="preserve">(depending on the survey type) </w:t>
+      </w:r>
+      <w:r>
+        <w:rPr>
+          <w:rFonts w:ascii="Calibri" w:eastAsia="Calibri" w:hAnsi="Calibri" w:cs="Calibri"/>
+          <w:color w:val="000000" w:themeColor="text1"/>
+          <w:lang w:val="en-US"/>
+        </w:rPr>
+        <w:t>and select it. Once it opens in the top left panel you might get warnings for missing packages like the one below</w:t>
       </w:r>
     </w:p>
     <w:p>
@@ -1511,6 +1551,14 @@
           <w:color w:val="000000" w:themeColor="text1"/>
           <w:lang w:val="en-US"/>
         </w:rPr>
+        <w:t xml:space="preserve"> see such warnings</w:t>
+      </w:r>
+      <w:r>
+        <w:rPr>
+          <w:rFonts w:ascii="Calibri" w:eastAsia="Calibri" w:hAnsi="Calibri" w:cs="Calibri"/>
+          <w:color w:val="000000" w:themeColor="text1"/>
+          <w:lang w:val="en-US"/>
+        </w:rPr>
         <w:t>.</w:t>
       </w:r>
     </w:p>
@@ -2019,18 +2067,60 @@
       </w:r>
     </w:p>
     <w:p>
-      <w:pPr>
-        <w:rPr>
-          <w:lang w:val="en-US"/>
-        </w:rPr>
-      </w:pPr>
       <w:r>
         <w:t xml:space="preserve">If you keep experiencing packages problems contact </w:t>
       </w:r>
       <w:r>
-        <w:t>Piera Carpi, Nikos Nikolioudakis or Erik Olsen for assistance</w:t>
-      </w:r>
-      <w:r>
+        <w:t xml:space="preserve">Maik Tiedemann, </w:t>
+      </w:r>
+      <w:r>
+        <w:t>Piera Carpi</w:t>
+      </w:r>
+      <w:r>
+        <w:t xml:space="preserve"> </w:t>
+      </w:r>
+      <w:r>
+        <w:t>or Erik Olsen for assistance</w:t>
+      </w:r>
+      <w:r>
+        <w:t>.</w:t>
+      </w:r>
+    </w:p>
+    <w:p/>
+    <w:p>
+      <w:pPr>
+        <w:rPr>
+          <w:lang w:val="en-US"/>
+        </w:rPr>
+      </w:pPr>
+      <w:r>
+        <w:t xml:space="preserve">Feedback for improvements of this User </w:t>
+      </w:r>
+      <w:r>
+        <w:t>Manual</w:t>
+      </w:r>
+      <w:r>
+        <w:t xml:space="preserve"> can be provided to </w:t>
+      </w:r>
+      <w:hyperlink r:id="rId13" w:history="1">
+        <w:r>
+          <w:rPr>
+            <w:rStyle w:val="Hyperlink"/>
+          </w:rPr>
+          <w:t>nikolaos.nikolioudakis</w:t>
+        </w:r>
+        <w:r>
+          <w:rPr>
+            <w:rStyle w:val="Hyperlink"/>
+            <w:lang w:val="en-US"/>
+          </w:rPr>
+          <w:t>@hi.no</w:t>
+        </w:r>
+      </w:hyperlink>
+      <w:r>
+        <w:rPr>
+          <w:lang w:val="en-US"/>
+        </w:rPr>
         <w:t>.</w:t>
       </w:r>
     </w:p>
@@ -2079,10 +2169,10 @@
           <w:noProof/>
         </w:rPr>
         <w:drawing>
-          <wp:inline distT="0" distB="0" distL="0" distR="0" wp14:anchorId="67739BEB" wp14:editId="5931665A">
-            <wp:extent cx="4496427" cy="1428949"/>
+          <wp:inline distT="0" distB="0" distL="0" distR="0" wp14:anchorId="1E630B59" wp14:editId="58B71FE2">
+            <wp:extent cx="2724530" cy="2286319"/>
             <wp:effectExtent l="0" t="0" r="0" b="0"/>
-            <wp:docPr id="3" name="Picture 3" descr="Graphical user interface, text&#10;&#10;Description automatically generated with medium confidence"/>
+            <wp:docPr id="10" name="Picture 10" descr="Text&#10;&#10;Description automatically generated"/>
             <wp:cNvGraphicFramePr>
               <a:graphicFrameLocks xmlns:a="http://schemas.openxmlformats.org/drawingml/2006/main" noChangeAspect="1"/>
             </wp:cNvGraphicFramePr>
@@ -2090,11 +2180,11 @@
               <a:graphicData uri="http://schemas.openxmlformats.org/drawingml/2006/picture">
                 <pic:pic xmlns:pic="http://schemas.openxmlformats.org/drawingml/2006/picture">
                   <pic:nvPicPr>
-                    <pic:cNvPr id="3" name="Picture 3" descr="Graphical user interface, text&#10;&#10;Description automatically generated with medium confidence"/>
+                    <pic:cNvPr id="10" name="Picture 10" descr="Text&#10;&#10;Description automatically generated"/>
                     <pic:cNvPicPr/>
                   </pic:nvPicPr>
                   <pic:blipFill>
-                    <a:blip r:embed="rId13"/>
+                    <a:blip r:embed="rId14"/>
                     <a:stretch>
                       <a:fillRect/>
                     </a:stretch>
@@ -2102,7 +2192,7 @@
                   <pic:spPr>
                     <a:xfrm>
                       <a:off x="0" y="0"/>
-                      <a:ext cx="4496427" cy="1428949"/>
+                      <a:ext cx="2724530" cy="2286319"/>
                     </a:xfrm>
                     <a:prstGeom prst="rect">
                       <a:avLst/>
@@ -2118,10 +2208,1142 @@
     <w:p/>
     <w:p>
       <w:r>
-        <w:t xml:space="preserve">The user is required to open the SailingOrdersDFN.Rmd file in administrator mode in R-Studio. Renaming of the file name is not allowed. </w:t>
-      </w:r>
-      <w:r>
-        <w:t>Once opened, the user should click on the icon looking like an “A” (Switch to visual markdown editor).</w:t>
+        <w:t>The user is required to open the SailingOrdersDFN.</w:t>
+      </w:r>
+      <w:r>
+        <w:t xml:space="preserve">Rproj </w:t>
+      </w:r>
+      <w:r>
+        <w:t xml:space="preserve">file in administrator mode in R-Studio. </w:t>
+      </w:r>
+    </w:p>
+    <w:p>
+      <w:pPr>
+        <w:rPr>
+          <w:b/>
+          <w:bCs/>
+          <w:u w:val="single"/>
+        </w:rPr>
+      </w:pPr>
+      <w:r>
+        <w:rPr>
+          <w:b/>
+          <w:bCs/>
+          <w:u w:val="single"/>
+        </w:rPr>
+        <w:t>Figures</w:t>
+      </w:r>
+    </w:p>
+    <w:p>
+      <w:r>
+        <w:t xml:space="preserve">In the _images folder, the user can include all images that are expected to be rendered in the output document. Renaming of the folder name is not allowed. </w:t>
+      </w:r>
+      <w:r>
+        <w:t>Change of f</w:t>
+      </w:r>
+      <w:r>
+        <w:t>ile names of images is permitted (but see further down for instructions).</w:t>
+      </w:r>
+    </w:p>
+    <w:p/>
+    <w:p>
+      <w:r>
+        <w:rPr>
+          <w:b/>
+          <w:bCs/>
+          <w:u w:val="single"/>
+        </w:rPr>
+        <w:t>Tables</w:t>
+      </w:r>
+    </w:p>
+    <w:p>
+      <w:r>
+        <w:t>In the _tables folder, the user is to open the excel file before rendering the SailingOrders document and include the info required in each sheet. Renaming of the file name or the sheets is not allowed</w:t>
+      </w:r>
+      <w:r>
+        <w:t>, but additional sheets can be added</w:t>
+      </w:r>
+      <w:r>
+        <w:t xml:space="preserve"> (see further down</w:t>
+      </w:r>
+      <w:r>
+        <w:t xml:space="preserve"> in the document </w:t>
+      </w:r>
+      <w:r>
+        <w:t>for instructions).</w:t>
+      </w:r>
+      <w:r>
+        <w:t xml:space="preserve"> The excel file can contain any number of sheets, relevant or irrelevant to the survey. The rendered document will include only those sheets specified in the code chunks.</w:t>
+      </w:r>
+    </w:p>
+    <w:p>
+      <w:r>
+        <w:br w:type="page"/>
+      </w:r>
+    </w:p>
+    <w:p>
+      <w:pPr>
+        <w:pStyle w:val="Heading2"/>
+        <w:rPr>
+          <w:rStyle w:val="Heading2Char"/>
+        </w:rPr>
+      </w:pPr>
+      <w:bookmarkStart w:id="3" w:name="_Toc101180834"/>
+      <w:r>
+        <w:rPr>
+          <w:rStyle w:val="Heading2Char"/>
+        </w:rPr>
+        <w:lastRenderedPageBreak/>
+        <w:t>C</w:t>
+      </w:r>
+      <w:r>
+        <w:rPr>
+          <w:rStyle w:val="Heading2Char"/>
+        </w:rPr>
+        <w:t>reation of the Sailing Orders</w:t>
+      </w:r>
+      <w:r>
+        <w:rPr>
+          <w:rStyle w:val="Heading2Char"/>
+        </w:rPr>
+        <w:t xml:space="preserve"> </w:t>
+      </w:r>
+      <w:r>
+        <w:rPr>
+          <w:rStyle w:val="Heading2Char"/>
+        </w:rPr>
+        <w:t>for a survey</w:t>
+      </w:r>
+      <w:bookmarkEnd w:id="3"/>
+    </w:p>
+    <w:p>
+      <w:pPr>
+        <w:rPr>
+          <w:b/>
+          <w:bCs/>
+        </w:rPr>
+      </w:pPr>
+      <w:r>
+        <w:rPr>
+          <w:b/>
+          <w:bCs/>
+        </w:rPr>
+        <w:t>Draft version:</w:t>
+      </w:r>
+    </w:p>
+    <w:p>
+      <w:r>
+        <w:t xml:space="preserve">For pre-survey meetings to be held a draft version of the Sailing Orders is required as a basis for the discussions. It is advisable that a draft Sailing Orders document is compiled and circulated to meeting participants </w:t>
+      </w:r>
+      <w:r>
+        <w:rPr>
+          <w:b/>
+          <w:bCs/>
+          <w:u w:val="single"/>
+        </w:rPr>
+        <w:t>before</w:t>
+      </w:r>
+      <w:r>
+        <w:t xml:space="preserve"> the meeting. To be able to compile a draft version of the Sailing Orders the following steps need to be ensured in the following order:</w:t>
+      </w:r>
+    </w:p>
+    <w:p>
+      <w:pPr>
+        <w:pStyle w:val="ListParagraph"/>
+        <w:numPr>
+          <w:ilvl w:val="0"/>
+          <w:numId w:val="18"/>
+        </w:numPr>
+      </w:pPr>
+      <w:r>
+        <w:t>The “</w:t>
+      </w:r>
+      <w:r>
+        <w:t>input_dataframes.xlsx</w:t>
+      </w:r>
+      <w:r>
+        <w:t>” is filled in as completely as possible.</w:t>
+      </w:r>
+    </w:p>
+    <w:p>
+      <w:pPr>
+        <w:pStyle w:val="ListParagraph"/>
+        <w:numPr>
+          <w:ilvl w:val="0"/>
+          <w:numId w:val="18"/>
+        </w:numPr>
+      </w:pPr>
+      <w:r>
+        <w:t>The images in the _images folder are the correct ones.</w:t>
+      </w:r>
+    </w:p>
+    <w:p>
+      <w:pPr>
+        <w:pStyle w:val="ListParagraph"/>
+        <w:numPr>
+          <w:ilvl w:val="0"/>
+          <w:numId w:val="18"/>
+        </w:numPr>
+      </w:pPr>
+      <w:r>
+        <w:t>The text part in the “SailingOrdersDFN</w:t>
+      </w:r>
+      <w:r>
+        <w:t>_pelagic</w:t>
+      </w:r>
+      <w:r>
+        <w:t xml:space="preserve">.Rmd” </w:t>
+      </w:r>
+      <w:r>
+        <w:t xml:space="preserve">or “SailingOrdersDFN_demersal.Rmd” </w:t>
+      </w:r>
+      <w:r>
+        <w:t>file is updated to the extent possible.</w:t>
+      </w:r>
+    </w:p>
+    <w:p>
+      <w:pPr>
+        <w:rPr>
+          <w:i/>
+          <w:iCs/>
+        </w:rPr>
+      </w:pPr>
+      <w:r>
+        <w:rPr>
+          <w:i/>
+          <w:iCs/>
+        </w:rPr>
+        <w:t>Note: The provided “SailingOrdersDFN.proj” contains all the necessary elements to compile a final version of Sailing Orders for a survey. However, the information rendered applies only to that specific survey.</w:t>
+      </w:r>
+    </w:p>
+    <w:p>
+      <w:r>
+        <w:rPr>
+          <w:b/>
+          <w:bCs/>
+        </w:rPr>
+        <w:t>For step (A)</w:t>
+      </w:r>
+      <w:r>
+        <w:t xml:space="preserve">, open the excel file in MS Excel and ensure that the correct information is provided in each sheet. </w:t>
+      </w:r>
+    </w:p>
+    <w:p>
+      <w:r>
+        <w:t>For each of the non-captions suffix sheets, a caption for the tables is required to be included in the “</w:t>
+      </w:r>
+      <w:r>
+        <w:t>tab_captions</w:t>
+      </w:r>
+      <w:r>
+        <w:t xml:space="preserve">” sheet. </w:t>
+      </w:r>
+    </w:p>
+    <w:p>
+      <w:r>
+        <w:t>If specific formatting is required for elements of the various tables</w:t>
+      </w:r>
+      <w:r>
+        <w:t>,</w:t>
+      </w:r>
+      <w:r>
+        <w:t xml:space="preserve"> the user can do it either in the Excel file using specific rules or do it manually every time that the output document will be compiled</w:t>
+      </w:r>
+      <w:r>
+        <w:t>.</w:t>
+      </w:r>
+    </w:p>
+    <w:p>
+      <w:pPr>
+        <w:pStyle w:val="ListParagraph"/>
+        <w:numPr>
+          <w:ilvl w:val="0"/>
+          <w:numId w:val="5"/>
+        </w:numPr>
+        <w:rPr>
+          <w:lang w:val="en-US"/>
+        </w:rPr>
+      </w:pPr>
+      <w:r>
+        <w:rPr>
+          <w:lang w:val="en-US"/>
+        </w:rPr>
+        <w:t>Inclusion of text with specific font face should be done in the input_text according to the following:</w:t>
+      </w:r>
+    </w:p>
+    <w:p>
+      <w:pPr>
+        <w:pStyle w:val="ListParagraph"/>
+        <w:numPr>
+          <w:ilvl w:val="1"/>
+          <w:numId w:val="5"/>
+        </w:numPr>
+        <w:rPr>
+          <w:lang w:val="en-US"/>
+        </w:rPr>
+      </w:pPr>
+      <w:r>
+        <w:rPr>
+          <w:lang w:val="en-US"/>
+        </w:rPr>
+        <w:t xml:space="preserve">For text to appear in italics surround the word with </w:t>
+      </w:r>
+      <w:r>
+        <w:rPr>
+          <w:lang w:val="en-US"/>
+        </w:rPr>
+        <w:t>single asterisks</w:t>
+      </w:r>
+      <w:r>
+        <w:rPr>
+          <w:lang w:val="en-US"/>
+        </w:rPr>
+        <w:t xml:space="preserve">, e.g. </w:t>
+      </w:r>
+      <w:r>
+        <w:rPr>
+          <w:lang w:val="en-US"/>
+        </w:rPr>
+        <w:t>*</w:t>
+      </w:r>
+      <w:r>
+        <w:rPr>
+          <w:lang w:val="en-US"/>
+        </w:rPr>
+        <w:t>italics</w:t>
+      </w:r>
+      <w:r>
+        <w:rPr>
+          <w:lang w:val="en-US"/>
+        </w:rPr>
+        <w:t>*</w:t>
+      </w:r>
+      <w:r>
+        <w:rPr>
+          <w:lang w:val="en-US"/>
+        </w:rPr>
+        <w:t xml:space="preserve"> will be in the output </w:t>
+      </w:r>
+      <w:r>
+        <w:rPr>
+          <w:i/>
+          <w:iCs/>
+          <w:lang w:val="en-US"/>
+        </w:rPr>
+        <w:t>italics</w:t>
+      </w:r>
+    </w:p>
+    <w:p>
+      <w:pPr>
+        <w:pStyle w:val="ListParagraph"/>
+        <w:numPr>
+          <w:ilvl w:val="1"/>
+          <w:numId w:val="5"/>
+        </w:numPr>
+        <w:rPr>
+          <w:rFonts w:eastAsiaTheme="minorEastAsia"/>
+          <w:i/>
+          <w:iCs/>
+          <w:lang w:val="en-US"/>
+        </w:rPr>
+      </w:pPr>
+      <w:r>
+        <w:rPr>
+          <w:lang w:val="en-US"/>
+        </w:rPr>
+        <w:t xml:space="preserve">For text to appear in bold surround the word with double asterisks, e.g. **bold** will be in the output </w:t>
+      </w:r>
+      <w:r>
+        <w:rPr>
+          <w:b/>
+          <w:bCs/>
+          <w:lang w:val="en-US"/>
+        </w:rPr>
+        <w:t>bold</w:t>
+      </w:r>
+    </w:p>
+    <w:p>
+      <w:pPr>
+        <w:pStyle w:val="ListParagraph"/>
+        <w:numPr>
+          <w:ilvl w:val="1"/>
+          <w:numId w:val="5"/>
+        </w:numPr>
+        <w:rPr>
+          <w:rFonts w:eastAsiaTheme="minorEastAsia"/>
+          <w:b/>
+          <w:bCs/>
+          <w:lang w:val="en-US"/>
+        </w:rPr>
+      </w:pPr>
+      <w:r>
+        <w:rPr>
+          <w:lang w:val="en-US"/>
+        </w:rPr>
+        <w:t>To combine the above use **</w:t>
+      </w:r>
+      <w:r>
+        <w:rPr>
+          <w:lang w:val="en-US"/>
+        </w:rPr>
+        <w:t>*</w:t>
+      </w:r>
+      <w:r>
+        <w:rPr>
+          <w:lang w:val="en-US"/>
+        </w:rPr>
+        <w:t>bold italics</w:t>
+      </w:r>
+      <w:r>
+        <w:rPr>
+          <w:i/>
+          <w:iCs/>
+          <w:lang w:val="en-US"/>
+        </w:rPr>
+        <w:t>*</w:t>
+      </w:r>
+      <w:r>
+        <w:rPr>
+          <w:i/>
+          <w:iCs/>
+          <w:lang w:val="en-US"/>
+        </w:rPr>
+        <w:t>*</w:t>
+      </w:r>
+      <w:r>
+        <w:rPr>
+          <w:lang w:val="en-US"/>
+        </w:rPr>
+        <w:t xml:space="preserve">* to get </w:t>
+      </w:r>
+      <w:r>
+        <w:rPr>
+          <w:b/>
+          <w:bCs/>
+          <w:i/>
+          <w:iCs/>
+          <w:lang w:val="en-US"/>
+        </w:rPr>
+        <w:t>bold italics</w:t>
+      </w:r>
+    </w:p>
+    <w:p>
+      <w:pPr>
+        <w:pStyle w:val="ListParagraph"/>
+        <w:numPr>
+          <w:ilvl w:val="1"/>
+          <w:numId w:val="5"/>
+        </w:numPr>
+        <w:rPr>
+          <w:rFonts w:eastAsiaTheme="minorEastAsia"/>
+          <w:b/>
+          <w:bCs/>
+          <w:lang w:val="en-US"/>
+        </w:rPr>
+      </w:pPr>
+      <w:r>
+        <w:rPr>
+          <w:lang w:val="en-US"/>
+        </w:rPr>
+        <w:t>To superscript surround the character with caret, e.g., x^2^ to give x</w:t>
+      </w:r>
+      <w:r>
+        <w:rPr>
+          <w:vertAlign w:val="superscript"/>
+          <w:lang w:val="en-US"/>
+        </w:rPr>
+        <w:t>2</w:t>
+      </w:r>
+    </w:p>
+    <w:p>
+      <w:pPr>
+        <w:pStyle w:val="ListParagraph"/>
+        <w:numPr>
+          <w:ilvl w:val="1"/>
+          <w:numId w:val="5"/>
+        </w:numPr>
+        <w:rPr>
+          <w:rFonts w:eastAsiaTheme="minorEastAsia"/>
+          <w:lang w:val="en-US"/>
+        </w:rPr>
+      </w:pPr>
+      <w:r>
+        <w:rPr>
+          <w:lang w:val="en-US"/>
+        </w:rPr>
+        <w:t>To subscript surround the character with tilde, e.g., x</w:t>
+      </w:r>
+      <w:r>
+        <w:rPr>
+          <w:rFonts w:ascii="Calibri" w:eastAsia="Calibri" w:hAnsi="Calibri" w:cs="Calibri"/>
+          <w:color w:val="232629"/>
+          <w:sz w:val="24"/>
+          <w:szCs w:val="24"/>
+        </w:rPr>
+        <w:t xml:space="preserve"> ~</w:t>
+      </w:r>
+      <w:r>
+        <w:rPr>
+          <w:lang w:val="en-US"/>
+        </w:rPr>
+        <w:t>2</w:t>
+      </w:r>
+      <w:r>
+        <w:rPr>
+          <w:rFonts w:ascii="Calibri" w:eastAsia="Calibri" w:hAnsi="Calibri" w:cs="Calibri"/>
+          <w:color w:val="232629"/>
+          <w:sz w:val="24"/>
+          <w:szCs w:val="24"/>
+        </w:rPr>
+        <w:t>~</w:t>
+      </w:r>
+      <w:r>
+        <w:rPr>
+          <w:lang w:val="en-US"/>
+        </w:rPr>
+        <w:t xml:space="preserve"> to give x</w:t>
+      </w:r>
+      <w:r>
+        <w:rPr>
+          <w:vertAlign w:val="subscript"/>
+          <w:lang w:val="en-US"/>
+        </w:rPr>
+        <w:t>2</w:t>
+      </w:r>
+    </w:p>
+    <w:p>
+      <w:pPr>
+        <w:pStyle w:val="ListParagraph"/>
+        <w:numPr>
+          <w:ilvl w:val="0"/>
+          <w:numId w:val="5"/>
+        </w:numPr>
+        <w:rPr>
+          <w:rFonts w:eastAsiaTheme="minorEastAsia"/>
+          <w:lang w:val="en-US"/>
+        </w:rPr>
+      </w:pPr>
+      <w:r>
+        <w:rPr>
+          <w:lang w:val="en-US"/>
+        </w:rPr>
+        <w:t>Color</w:t>
+      </w:r>
+      <w:r>
+        <w:rPr>
+          <w:lang w:val="en-US"/>
+        </w:rPr>
+        <w:t>-coding in the excel files does not work. Footnotes need to be used instead. To include a footnote</w:t>
+      </w:r>
+      <w:r>
+        <w:rPr>
+          <w:lang w:val="en-US"/>
+        </w:rPr>
+        <w:t>, in the cell that the footnote applies</w:t>
+      </w:r>
+      <w:r>
+        <w:rPr>
+          <w:lang w:val="en-US"/>
+        </w:rPr>
+        <w:t>,</w:t>
+      </w:r>
+      <w:r>
+        <w:rPr>
+          <w:lang w:val="en-US"/>
+        </w:rPr>
+        <w:t xml:space="preserve"> the following </w:t>
+      </w:r>
+      <w:r>
+        <w:rPr>
+          <w:lang w:val="en-US"/>
+        </w:rPr>
+        <w:t>(</w:t>
+      </w:r>
+      <w:r>
+        <w:rPr>
+          <w:lang w:val="en-US"/>
+        </w:rPr>
+        <w:t>without the quotes</w:t>
+      </w:r>
+      <w:r>
+        <w:rPr>
+          <w:lang w:val="en-US"/>
+        </w:rPr>
+        <w:t>)</w:t>
+      </w:r>
+      <w:r>
+        <w:rPr>
+          <w:lang w:val="en-US"/>
+        </w:rPr>
+        <w:t xml:space="preserve"> “^[footnote text]”</w:t>
+      </w:r>
+      <w:r>
+        <w:rPr>
+          <w:lang w:val="en-US"/>
+        </w:rPr>
+        <w:t xml:space="preserve"> needs to be typed</w:t>
+      </w:r>
+      <w:r>
+        <w:rPr>
+          <w:lang w:val="en-US"/>
+        </w:rPr>
+        <w:t xml:space="preserve">. </w:t>
+      </w:r>
+      <w:r>
+        <w:rPr>
+          <w:lang w:val="en-US"/>
+        </w:rPr>
+        <w:t>Additional</w:t>
+      </w:r>
+      <w:r>
+        <w:rPr>
+          <w:lang w:val="en-US"/>
+        </w:rPr>
+        <w:t xml:space="preserve"> footnotes (e.g.</w:t>
+      </w:r>
+      <w:r>
+        <w:rPr>
+          <w:lang w:val="en-US"/>
+        </w:rPr>
+        <w:t>,</w:t>
+      </w:r>
+      <w:r>
+        <w:rPr>
+          <w:lang w:val="en-US"/>
+        </w:rPr>
+        <w:t xml:space="preserve"> 1, 2, 3) will appear automatically as long as the user adds additional notations as the one shown in</w:t>
+      </w:r>
+      <w:r>
+        <w:rPr>
+          <w:lang w:val="en-US"/>
+        </w:rPr>
+        <w:t>side</w:t>
+      </w:r>
+      <w:r>
+        <w:rPr>
+          <w:lang w:val="en-US"/>
+        </w:rPr>
+        <w:t xml:space="preserve"> the </w:t>
+      </w:r>
+      <w:r>
+        <w:rPr>
+          <w:lang w:val="en-US"/>
+        </w:rPr>
+        <w:t>quotes</w:t>
+      </w:r>
+      <w:r>
+        <w:rPr>
+          <w:lang w:val="en-US"/>
+        </w:rPr>
+        <w:t xml:space="preserve"> above.</w:t>
+      </w:r>
+    </w:p>
+    <w:p>
+      <w:pPr>
+        <w:pStyle w:val="ListParagraph"/>
+        <w:numPr>
+          <w:ilvl w:val="0"/>
+          <w:numId w:val="5"/>
+        </w:numPr>
+        <w:rPr>
+          <w:rFonts w:eastAsiaTheme="minorEastAsia"/>
+          <w:lang w:val="en-US"/>
+        </w:rPr>
+      </w:pPr>
+      <w:r>
+        <w:rPr>
+          <w:lang w:val="en-US"/>
+        </w:rPr>
+        <w:t xml:space="preserve">The cells that contain dates need to have the following format without the square brackets </w:t>
+      </w:r>
+      <w:r>
+        <w:rPr>
+          <w:b/>
+          <w:bCs/>
+          <w:u w:val="single"/>
+          <w:lang w:val="en-US"/>
+        </w:rPr>
+        <w:t>but with</w:t>
+      </w:r>
+      <w:r>
+        <w:rPr>
+          <w:lang w:val="en-US"/>
+        </w:rPr>
+        <w:t xml:space="preserve"> the apostrophe before the dd: [‘dd/mm/yyyy]. This will convert the date into a character string and avoid the different date format settings </w:t>
+      </w:r>
+      <w:r>
+        <w:rPr>
+          <w:lang w:val="en-US"/>
+        </w:rPr>
+        <w:t>of individual users’ machines.</w:t>
+      </w:r>
+    </w:p>
+    <w:p>
+      <w:pPr>
+        <w:pStyle w:val="ListParagraph"/>
+        <w:numPr>
+          <w:ilvl w:val="0"/>
+          <w:numId w:val="5"/>
+        </w:numPr>
+        <w:rPr>
+          <w:rFonts w:eastAsiaTheme="minorEastAsia"/>
+          <w:lang w:val="en-US"/>
+        </w:rPr>
+      </w:pPr>
+      <w:r>
+        <w:rPr>
+          <w:lang w:val="en-US"/>
+        </w:rPr>
+        <w:t>The “reqparttab” sheet</w:t>
+      </w:r>
+      <w:r>
+        <w:rPr>
+          <w:lang w:val="en-US"/>
+        </w:rPr>
+        <w:t>:</w:t>
+      </w:r>
+    </w:p>
+    <w:p>
+      <w:pPr>
+        <w:pStyle w:val="ListParagraph"/>
+        <w:numPr>
+          <w:ilvl w:val="1"/>
+          <w:numId w:val="5"/>
+        </w:numPr>
+        <w:rPr>
+          <w:rFonts w:eastAsiaTheme="minorEastAsia"/>
+          <w:lang w:val="en-US"/>
+        </w:rPr>
+      </w:pPr>
+      <w:r>
+        <w:rPr>
+          <w:lang w:val="en-US"/>
+        </w:rPr>
+        <w:t xml:space="preserve"> contains formulas in the </w:t>
+      </w:r>
+      <w:r>
+        <w:rPr>
+          <w:b/>
+          <w:bCs/>
+          <w:lang w:val="en-US"/>
+        </w:rPr>
+        <w:t>non-IMR (DFN core)</w:t>
+      </w:r>
+      <w:r>
+        <w:rPr>
+          <w:b/>
+          <w:bCs/>
+          <w:lang w:val="en-US"/>
+        </w:rPr>
+        <w:t>,</w:t>
+      </w:r>
+      <w:r>
+        <w:rPr>
+          <w:lang w:val="en-US"/>
+        </w:rPr>
+        <w:t xml:space="preserve"> </w:t>
+      </w:r>
+      <w:r>
+        <w:rPr>
+          <w:b/>
+          <w:bCs/>
+          <w:lang w:val="en-US"/>
+        </w:rPr>
+        <w:t>Total non-IMR personnel</w:t>
+      </w:r>
+      <w:r>
+        <w:rPr>
+          <w:lang w:val="en-US"/>
+        </w:rPr>
+        <w:t xml:space="preserve"> </w:t>
+      </w:r>
+      <w:r>
+        <w:rPr>
+          <w:lang w:val="en-US"/>
+        </w:rPr>
+        <w:t xml:space="preserve">and </w:t>
+      </w:r>
+      <w:r>
+        <w:rPr>
+          <w:b/>
+          <w:bCs/>
+          <w:lang w:val="en-US"/>
+        </w:rPr>
+        <w:t>Missing personnel</w:t>
+      </w:r>
+      <w:r>
+        <w:rPr>
+          <w:lang w:val="en-US"/>
+        </w:rPr>
+        <w:t xml:space="preserve"> </w:t>
+      </w:r>
+      <w:r>
+        <w:rPr>
+          <w:lang w:val="en-US"/>
+        </w:rPr>
+        <w:t>columns</w:t>
+      </w:r>
+      <w:r>
+        <w:rPr>
+          <w:lang w:val="en-US"/>
+        </w:rPr>
+        <w:t xml:space="preserve">. </w:t>
+      </w:r>
+      <w:r>
+        <w:rPr>
+          <w:b/>
+          <w:bCs/>
+          <w:u w:val="single"/>
+          <w:lang w:val="en-US"/>
+        </w:rPr>
+        <w:t>The user must not type values in these columns, as they are calculated automatically</w:t>
+      </w:r>
+      <w:r>
+        <w:rPr>
+          <w:lang w:val="en-US"/>
+        </w:rPr>
+        <w:t>.</w:t>
+      </w:r>
+    </w:p>
+    <w:p>
+      <w:pPr>
+        <w:pStyle w:val="ListParagraph"/>
+        <w:numPr>
+          <w:ilvl w:val="1"/>
+          <w:numId w:val="5"/>
+        </w:numPr>
+        <w:rPr>
+          <w:rFonts w:eastAsiaTheme="minorEastAsia"/>
+          <w:lang w:val="en-US"/>
+        </w:rPr>
+      </w:pPr>
+      <w:r>
+        <w:rPr>
+          <w:lang w:val="en-US"/>
+        </w:rPr>
+        <w:t xml:space="preserve">The user can add additional Legs (e.g. Leg 4.1, Leg 4.2, etc. with the respective </w:t>
+      </w:r>
+      <w:r>
+        <w:rPr>
+          <w:lang w:val="en-US"/>
+        </w:rPr>
+        <w:t>Position/laboratory</w:t>
+      </w:r>
+      <w:r>
+        <w:rPr>
+          <w:lang w:val="en-US"/>
+        </w:rPr>
+        <w:t xml:space="preserve"> entries. To do so, copy and paste (normal paste</w:t>
+      </w:r>
+      <w:r>
+        <w:rPr>
+          <w:lang w:val="en-US"/>
+        </w:rPr>
+        <w:t>,</w:t>
+      </w:r>
+      <w:r>
+        <w:rPr>
+          <w:lang w:val="en-US"/>
+        </w:rPr>
+        <w:t xml:space="preserve"> not paste </w:t>
+      </w:r>
+      <w:r>
+        <w:rPr>
+          <w:lang w:val="en-US"/>
+        </w:rPr>
+        <w:lastRenderedPageBreak/>
+        <w:t>special values) the rows of an existing Leg (e.g. Leg 4.1) and rename the Leg into the desired. For consistency, use the format “Leg 4.1” with a space between the word and the number(s). Note that the “4.1” serves just as an example; this could be any numbering. Additionally, if the</w:t>
+      </w:r>
+      <w:r>
+        <w:rPr>
+          <w:lang w:val="en-US"/>
+        </w:rPr>
+        <w:t xml:space="preserve"> Leg is split into parts, e.g., part A and part B due to within Leg port calls, the user should use the notation “Leg 4.1A” and “Leg 4.1B”. This only applies if the requested participants number per part changes. If it remains the same the “A” and “B” notation should be avoided.</w:t>
+      </w:r>
+    </w:p>
+    <w:p>
+      <w:pPr>
+        <w:pStyle w:val="ListParagraph"/>
+        <w:numPr>
+          <w:ilvl w:val="1"/>
+          <w:numId w:val="5"/>
+        </w:numPr>
+        <w:rPr>
+          <w:rFonts w:eastAsiaTheme="minorEastAsia"/>
+          <w:lang w:val="en-US"/>
+        </w:rPr>
+      </w:pPr>
+      <w:r>
+        <w:rPr>
+          <w:lang w:val="en-US"/>
+        </w:rPr>
+        <w:t xml:space="preserve">The user can include a row in Excel (per Leg or per Part) if desired to sum column(s) contents for ease. This/these rows with sums need to be deleted before the code is run. The code calculates automatically the </w:t>
+      </w:r>
+      <w:r>
+        <w:rPr>
+          <w:lang w:val="en-US"/>
+        </w:rPr>
+        <w:t>columns</w:t>
+      </w:r>
+      <w:r>
+        <w:rPr>
+          <w:lang w:val="en-US"/>
+        </w:rPr>
+        <w:t xml:space="preserve"> sums and they are presented in the rendered table in the .docx produced. </w:t>
+      </w:r>
+    </w:p>
+    <w:p>
+      <w:pPr>
+        <w:pStyle w:val="ListParagraph"/>
+        <w:numPr>
+          <w:ilvl w:val="1"/>
+          <w:numId w:val="5"/>
+        </w:numPr>
+        <w:rPr>
+          <w:rFonts w:eastAsiaTheme="minorEastAsia"/>
+          <w:lang w:val="en-US"/>
+        </w:rPr>
+      </w:pPr>
+      <w:r>
+        <w:rPr>
+          <w:lang w:val="en-US"/>
+        </w:rPr>
+        <w:t xml:space="preserve">If more partner countries need to be added, right click in Excel in a column between the </w:t>
+      </w:r>
+      <w:r>
+        <w:rPr>
+          <w:b/>
+          <w:bCs/>
+          <w:lang w:val="en-US"/>
+        </w:rPr>
+        <w:t>non-IMR (DFN core)</w:t>
+      </w:r>
+      <w:r>
+        <w:rPr>
+          <w:lang w:val="en-US"/>
+        </w:rPr>
+        <w:t xml:space="preserve"> and </w:t>
+      </w:r>
+      <w:r>
+        <w:rPr>
+          <w:b/>
+          <w:bCs/>
+          <w:lang w:val="en-US"/>
+        </w:rPr>
+        <w:t>FAO/External experts</w:t>
+      </w:r>
+      <w:r>
+        <w:rPr>
+          <w:lang w:val="en-US"/>
+        </w:rPr>
+        <w:t xml:space="preserve"> columns, select insert column and type the name of the country and the requested participants per</w:t>
+      </w:r>
+      <w:r>
+        <w:rPr>
+          <w:b/>
+          <w:bCs/>
+          <w:lang w:val="en-US"/>
+        </w:rPr>
+        <w:t xml:space="preserve"> </w:t>
+      </w:r>
+      <w:r>
+        <w:rPr>
+          <w:b/>
+          <w:bCs/>
+          <w:lang w:val="en-US"/>
+        </w:rPr>
+        <w:t>Position/laboratory</w:t>
+      </w:r>
+      <w:r>
+        <w:rPr>
+          <w:lang w:val="en-US"/>
+        </w:rPr>
+        <w:t>.</w:t>
+      </w:r>
+    </w:p>
+    <w:p>
+      <w:pPr>
+        <w:pStyle w:val="ListParagraph"/>
+        <w:numPr>
+          <w:ilvl w:val="1"/>
+          <w:numId w:val="5"/>
+        </w:numPr>
+        <w:rPr>
+          <w:rFonts w:eastAsiaTheme="minorEastAsia"/>
+          <w:lang w:val="en-US"/>
+        </w:rPr>
+      </w:pPr>
+      <w:r>
+        <w:rPr>
+          <w:lang w:val="en-US"/>
+        </w:rPr>
+        <w:t xml:space="preserve">The </w:t>
+      </w:r>
+      <w:r>
+        <w:rPr>
+          <w:b/>
+          <w:bCs/>
+          <w:lang w:val="en-US"/>
+        </w:rPr>
+        <w:t>Min personnel</w:t>
+      </w:r>
+      <w:r>
+        <w:rPr>
+          <w:lang w:val="en-US"/>
+        </w:rPr>
+        <w:t xml:space="preserve"> </w:t>
+      </w:r>
+      <w:r>
+        <w:rPr>
+          <w:lang w:val="en-US"/>
+        </w:rPr>
+        <w:t xml:space="preserve">and </w:t>
+      </w:r>
+      <w:r>
+        <w:rPr>
+          <w:b/>
+          <w:bCs/>
+          <w:lang w:val="en-US"/>
+        </w:rPr>
+        <w:t>Missing personnel</w:t>
+      </w:r>
+      <w:r>
+        <w:rPr>
+          <w:b/>
+          <w:bCs/>
+          <w:lang w:val="en-US"/>
+        </w:rPr>
+        <w:t xml:space="preserve"> </w:t>
+      </w:r>
+      <w:r>
+        <w:rPr>
+          <w:lang w:val="en-US"/>
+        </w:rPr>
+        <w:t>are excluded from the rendered table in the document</w:t>
+      </w:r>
+      <w:r>
+        <w:rPr>
+          <w:lang w:val="en-US"/>
+        </w:rPr>
+        <w:t>.</w:t>
+      </w:r>
+    </w:p>
+    <w:p>
+      <w:pPr>
+        <w:rPr>
+          <w:lang w:val="en-US"/>
+        </w:rPr>
+      </w:pPr>
+    </w:p>
+    <w:p>
+      <w:pPr>
+        <w:rPr>
+          <w:lang w:val="en-US"/>
+        </w:rPr>
+      </w:pPr>
+      <w:r>
+        <w:rPr>
+          <w:lang w:val="en-US"/>
+        </w:rPr>
+        <w:t xml:space="preserve">The user should avoid merging cells in the </w:t>
+      </w:r>
+      <w:r>
+        <w:t>“</w:t>
+      </w:r>
+      <w:r>
+        <w:t>input_dataframes.xlsx</w:t>
+      </w:r>
+      <w:r>
+        <w:t xml:space="preserve">” sheets. The tidier and plainer a table is, the rendering will be the intended one. </w:t>
+      </w:r>
+      <w:r>
+        <w:t xml:space="preserve">In some cases, additional columns can be added if required, but this is </w:t>
+      </w:r>
+      <w:r>
+        <w:t>table dependent</w:t>
+      </w:r>
+      <w:r>
+        <w:t>. In the reqparttab columns A, B and C are not to be renamed</w:t>
+      </w:r>
+      <w:r>
+        <w:t xml:space="preserve">. </w:t>
+      </w:r>
+      <w:r>
+        <w:t>If complicated table structures are required and inevitable, contact Piera Carpi or Nikos Nikolioudakis.</w:t>
+      </w:r>
+    </w:p>
+    <w:p>
+      <w:r>
+        <w:rPr>
+          <w:b/>
+          <w:bCs/>
+        </w:rPr>
+        <w:t>For step (B)</w:t>
+      </w:r>
+      <w:r>
+        <w:t>, under the _images folder, the user can include all images that are expected to be rendered in the output document. Renaming of the folder name is not allowed. Change of file names of images is permitted (but see further down for instructions). Preferential image format is .png or .jpeg. The code might need to be adjusted accordingly if .jpeg images are included. Once the user has placed the images in the folder, correspondence must be ensured between the file names of the images and what is listed in the “fig</w:t>
+      </w:r>
+      <w:r>
+        <w:t>_</w:t>
+      </w:r>
+      <w:r>
+        <w:t>captions” sheet of the “</w:t>
+      </w:r>
+      <w:r>
+        <w:t>input_dataframes.xlsx</w:t>
+      </w:r>
+      <w:r>
+        <w:t xml:space="preserve">”. Otherwise, the image captions will not be rendered and cross-referencing in the output document will not work as intended. </w:t>
+      </w:r>
+    </w:p>
+    <w:p/>
+    <w:p>
+      <w:r>
+        <w:rPr>
+          <w:b/>
+          <w:bCs/>
+        </w:rPr>
+        <w:t xml:space="preserve">For </w:t>
+      </w:r>
+      <w:r>
+        <w:rPr>
+          <w:b/>
+          <w:bCs/>
+        </w:rPr>
+        <w:t>step (C)</w:t>
+      </w:r>
+      <w:r>
+        <w:t xml:space="preserve">, </w:t>
+      </w:r>
+      <w:r>
+        <w:t>the text editing t</w:t>
+      </w:r>
+      <w:r>
+        <w:t xml:space="preserve">he user is required to open the </w:t>
+      </w:r>
+      <w:r>
+        <w:t>“</w:t>
+      </w:r>
+      <w:r>
+        <w:t>SailingOrdersDFN</w:t>
+      </w:r>
+      <w:r>
+        <w:t>_pelagic</w:t>
+      </w:r>
+      <w:r>
+        <w:t>.Rmd</w:t>
+      </w:r>
+      <w:r>
+        <w:t>”</w:t>
+      </w:r>
+      <w:r>
+        <w:t xml:space="preserve"> </w:t>
+      </w:r>
+      <w:r>
+        <w:t xml:space="preserve">or the “SailingOrdersDFN_demersal.Rmd” </w:t>
+      </w:r>
+      <w:r>
+        <w:t>file in administrator mode in R-Studio. Renaming of the file name is not allowed. Once opened, the user should click on the icon looking like an “A” (Switch to visual markdown editor).</w:t>
       </w:r>
     </w:p>
     <w:p>
@@ -2130,10 +3352,10 @@
           <w:noProof/>
         </w:rPr>
         <w:drawing>
-          <wp:inline distT="0" distB="0" distL="0" distR="0" wp14:anchorId="6859C784" wp14:editId="574811BB">
+          <wp:inline distT="0" distB="0" distL="0" distR="0" wp14:anchorId="1FAB8FBD" wp14:editId="13B61A2F">
             <wp:extent cx="3829584" cy="1057423"/>
             <wp:effectExtent l="0" t="0" r="0" b="9525"/>
-            <wp:docPr id="4" name="Picture 4" descr="Graphical user interface, text, application&#10;&#10;Description automatically generated"/>
+            <wp:docPr id="6" name="Picture 6" descr="Graphical user interface, text, application&#10;&#10;Description automatically generated"/>
             <wp:cNvGraphicFramePr>
               <a:graphicFrameLocks xmlns:a="http://schemas.openxmlformats.org/drawingml/2006/main" noChangeAspect="1"/>
             </wp:cNvGraphicFramePr>
@@ -2145,7 +3367,7 @@
                     <pic:cNvPicPr/>
                   </pic:nvPicPr>
                   <pic:blipFill>
-                    <a:blip r:embed="rId14"/>
+                    <a:blip r:embed="rId15"/>
                     <a:stretch>
                       <a:fillRect/>
                     </a:stretch>
@@ -2177,11 +3399,12 @@
         <w:rPr>
           <w:noProof/>
         </w:rPr>
+        <w:lastRenderedPageBreak/>
         <w:drawing>
-          <wp:inline distT="0" distB="0" distL="0" distR="0" wp14:anchorId="064DFBC4" wp14:editId="40CBFCAA">
+          <wp:inline distT="0" distB="0" distL="0" distR="0" wp14:anchorId="4C172C5B" wp14:editId="300D6A23">
             <wp:extent cx="5731510" cy="246380"/>
             <wp:effectExtent l="0" t="0" r="2540" b="1270"/>
-            <wp:docPr id="5" name="Picture 5"/>
+            <wp:docPr id="7" name="Picture 7"/>
             <wp:cNvGraphicFramePr>
               <a:graphicFrameLocks xmlns:a="http://schemas.openxmlformats.org/drawingml/2006/main" noChangeAspect="1"/>
             </wp:cNvGraphicFramePr>
@@ -2193,7 +3416,7 @@
                     <pic:cNvPicPr/>
                   </pic:nvPicPr>
                   <pic:blipFill>
-                    <a:blip r:embed="rId15"/>
+                    <a:blip r:embed="rId16"/>
                     <a:stretch>
                       <a:fillRect/>
                     </a:stretch>
@@ -2214,78 +3437,6 @@
         </w:drawing>
       </w:r>
     </w:p>
-    <w:p/>
-    <w:p>
-      <w:r>
-        <w:t xml:space="preserve">In the _images folder, the user can include all images that are expected to be rendered in the output document. Renaming of the folder name is not allowed. </w:t>
-      </w:r>
-      <w:r>
-        <w:t>Change of f</w:t>
-      </w:r>
-      <w:r>
-        <w:t>ile names of images is permitted (but see further down for instructions).</w:t>
-      </w:r>
-    </w:p>
-    <w:p>
-      <w:r>
-        <w:t>In the _tables folder, the user is to open the excel file before rendering the SailingOrders document and included the info required in each sheet. Renaming of the file name or the sheets is not allowed</w:t>
-      </w:r>
-      <w:r>
-        <w:t>, but additional sheets can be added</w:t>
-      </w:r>
-      <w:r>
-        <w:t xml:space="preserve"> (</w:t>
-      </w:r>
-      <w:r>
-        <w:t>b</w:t>
-      </w:r>
-      <w:r>
-        <w:t>ut see further down for instructions).</w:t>
-      </w:r>
-      <w:r>
-        <w:t xml:space="preserve"> </w:t>
-      </w:r>
-    </w:p>
-    <w:p>
-      <w:r>
-        <w:br w:type="page"/>
-      </w:r>
-    </w:p>
-    <w:p>
-      <w:pPr>
-        <w:pStyle w:val="Heading2"/>
-        <w:rPr>
-          <w:rStyle w:val="Heading2Char"/>
-        </w:rPr>
-      </w:pPr>
-      <w:bookmarkStart w:id="3" w:name="_Toc101180834"/>
-      <w:r>
-        <w:rPr>
-          <w:rStyle w:val="Heading2Char"/>
-        </w:rPr>
-        <w:lastRenderedPageBreak/>
-        <w:t>C</w:t>
-      </w:r>
-      <w:r>
-        <w:rPr>
-          <w:rStyle w:val="Heading2Char"/>
-        </w:rPr>
-        <w:t>reation of the Sailing Orders</w:t>
-      </w:r>
-      <w:r>
-        <w:rPr>
-          <w:rStyle w:val="Heading2Char"/>
-        </w:rPr>
-        <w:t xml:space="preserve"> </w:t>
-      </w:r>
-      <w:r>
-        <w:rPr>
-          <w:rStyle w:val="Heading2Char"/>
-        </w:rPr>
-        <w:t>for a survey</w:t>
-      </w:r>
-      <w:bookmarkEnd w:id="3"/>
-    </w:p>
     <w:p>
       <w:pPr>
         <w:rPr>
@@ -2298,659 +3449,21 @@
           <w:b/>
           <w:bCs/>
         </w:rPr>
-        <w:t>Draft version:</w:t>
-      </w:r>
-    </w:p>
-    <w:p>
-      <w:r>
-        <w:t>For pre-survey meetings to be held a draft version of the Sailing Orders is required as a basis for the discussions. It is advisable that a draft Sailing Orders document is compiled and circulated to meeting participants before the meeting. To be able to compile a draft version of the Sailing Orders the following steps need to be ensured in the following order:</w:t>
-      </w:r>
-    </w:p>
-    <w:p>
-      <w:pPr>
-        <w:pStyle w:val="ListParagraph"/>
-        <w:numPr>
-          <w:ilvl w:val="0"/>
-          <w:numId w:val="18"/>
-        </w:numPr>
-      </w:pPr>
-      <w:r>
-        <w:t>The “</w:t>
-      </w:r>
-      <w:r>
-        <w:t>input_dataframes.xlsx</w:t>
-      </w:r>
-      <w:r>
-        <w:t>” is filled in as completely as possible.</w:t>
-      </w:r>
-    </w:p>
-    <w:p>
-      <w:pPr>
-        <w:pStyle w:val="ListParagraph"/>
-        <w:numPr>
-          <w:ilvl w:val="0"/>
-          <w:numId w:val="18"/>
-        </w:numPr>
-      </w:pPr>
-      <w:r>
-        <w:t>The images in the _images folder are the correct ones.</w:t>
-      </w:r>
-    </w:p>
-    <w:p>
-      <w:pPr>
-        <w:pStyle w:val="ListParagraph"/>
-        <w:numPr>
-          <w:ilvl w:val="0"/>
-          <w:numId w:val="18"/>
-        </w:numPr>
-      </w:pPr>
-      <w:r>
-        <w:t>The text part in the “SailingOrdersDFN.Rmd” file is updated to the extent possible.</w:t>
-      </w:r>
-    </w:p>
-    <w:p>
-      <w:pPr>
-        <w:rPr>
-          <w:i/>
-          <w:iCs/>
-        </w:rPr>
-      </w:pPr>
-      <w:r>
-        <w:rPr>
-          <w:i/>
-          <w:iCs/>
-        </w:rPr>
-        <w:t>Note: The provided “SailingOrdersDFN.proj” contains all the necessary elements to compile a final version of Sailing Orders for a survey. However, the information rendered applies only to that specific survey.</w:t>
-      </w:r>
-    </w:p>
-    <w:p>
-      <w:r>
-        <w:rPr>
-          <w:b/>
-          <w:bCs/>
-        </w:rPr>
-        <w:t>For step (A)</w:t>
-      </w:r>
-      <w:r>
-        <w:t xml:space="preserve">, open the excel file in MS Excel and ensure that the correct information is provided in each sheet. </w:t>
-      </w:r>
-    </w:p>
-    <w:p>
-      <w:r>
-        <w:t>For each of the non-captions suffix sheets, a caption for the tables is required to be included in the “</w:t>
-      </w:r>
-      <w:r>
-        <w:t>tab_captions</w:t>
-      </w:r>
-      <w:r>
-        <w:t xml:space="preserve">” sheet. </w:t>
-      </w:r>
-    </w:p>
-    <w:p>
-      <w:r>
-        <w:t>If specific formatting is required for elements of the various tables the user can do it either in the Excel file using specific rules or do it manually every time that the output document will be compiled</w:t>
-      </w:r>
-      <w:r>
-        <w:t>.</w:t>
-      </w:r>
-    </w:p>
-    <w:p>
-      <w:pPr>
-        <w:pStyle w:val="ListParagraph"/>
-        <w:numPr>
-          <w:ilvl w:val="0"/>
-          <w:numId w:val="5"/>
-        </w:numPr>
-        <w:rPr>
-          <w:lang w:val="en-US"/>
-        </w:rPr>
-      </w:pPr>
-      <w:r>
-        <w:rPr>
-          <w:lang w:val="en-US"/>
-        </w:rPr>
-        <w:t>Inclusion of text with specific font face should be done in the input_text according to the following:</w:t>
-      </w:r>
-    </w:p>
-    <w:p>
-      <w:pPr>
-        <w:pStyle w:val="ListParagraph"/>
-        <w:numPr>
-          <w:ilvl w:val="1"/>
-          <w:numId w:val="5"/>
-        </w:numPr>
-        <w:rPr>
-          <w:lang w:val="en-US"/>
-        </w:rPr>
-      </w:pPr>
-      <w:r>
-        <w:rPr>
-          <w:lang w:val="en-US"/>
-        </w:rPr>
-        <w:t xml:space="preserve">For text to appear in italics surround the word with </w:t>
-      </w:r>
-      <w:r>
-        <w:rPr>
-          <w:lang w:val="en-US"/>
-        </w:rPr>
-        <w:t>single asterisks</w:t>
-      </w:r>
-      <w:r>
-        <w:rPr>
-          <w:lang w:val="en-US"/>
-        </w:rPr>
-        <w:t xml:space="preserve">, e.g. </w:t>
-      </w:r>
-      <w:r>
-        <w:rPr>
-          <w:lang w:val="en-US"/>
-        </w:rPr>
-        <w:t>*</w:t>
-      </w:r>
-      <w:r>
-        <w:rPr>
-          <w:lang w:val="en-US"/>
-        </w:rPr>
-        <w:t>italics</w:t>
-      </w:r>
-      <w:r>
-        <w:rPr>
-          <w:lang w:val="en-US"/>
-        </w:rPr>
-        <w:t>*</w:t>
-      </w:r>
-      <w:r>
-        <w:rPr>
-          <w:lang w:val="en-US"/>
-        </w:rPr>
-        <w:t xml:space="preserve"> will be in the output </w:t>
-      </w:r>
-      <w:r>
-        <w:rPr>
-          <w:i/>
-          <w:iCs/>
-          <w:lang w:val="en-US"/>
-        </w:rPr>
-        <w:t>italics</w:t>
-      </w:r>
-    </w:p>
-    <w:p>
-      <w:pPr>
-        <w:pStyle w:val="ListParagraph"/>
-        <w:numPr>
-          <w:ilvl w:val="1"/>
-          <w:numId w:val="5"/>
-        </w:numPr>
-        <w:rPr>
-          <w:rFonts w:eastAsiaTheme="minorEastAsia"/>
-          <w:i/>
-          <w:iCs/>
-          <w:lang w:val="en-US"/>
-        </w:rPr>
-      </w:pPr>
-      <w:r>
-        <w:rPr>
-          <w:lang w:val="en-US"/>
-        </w:rPr>
-        <w:t xml:space="preserve">For text to appear in bold surround the word with double asterisks, e.g. **bold** will be in the output </w:t>
-      </w:r>
-      <w:r>
-        <w:rPr>
-          <w:b/>
-          <w:bCs/>
-          <w:lang w:val="en-US"/>
-        </w:rPr>
-        <w:t>bold</w:t>
-      </w:r>
-    </w:p>
-    <w:p>
-      <w:pPr>
-        <w:pStyle w:val="ListParagraph"/>
-        <w:numPr>
-          <w:ilvl w:val="1"/>
-          <w:numId w:val="5"/>
-        </w:numPr>
-        <w:rPr>
-          <w:rFonts w:eastAsiaTheme="minorEastAsia"/>
-          <w:b/>
-          <w:bCs/>
-          <w:lang w:val="en-US"/>
-        </w:rPr>
-      </w:pPr>
-      <w:r>
-        <w:rPr>
-          <w:lang w:val="en-US"/>
-        </w:rPr>
-        <w:t>To combine the above use **</w:t>
-      </w:r>
-      <w:r>
-        <w:rPr>
-          <w:lang w:val="en-US"/>
-        </w:rPr>
-        <w:t>*</w:t>
-      </w:r>
-      <w:r>
-        <w:rPr>
-          <w:lang w:val="en-US"/>
-        </w:rPr>
-        <w:t>bold italics</w:t>
-      </w:r>
-      <w:r>
-        <w:rPr>
-          <w:i/>
-          <w:iCs/>
-          <w:lang w:val="en-US"/>
-        </w:rPr>
-        <w:t>*</w:t>
-      </w:r>
-      <w:r>
-        <w:rPr>
-          <w:i/>
-          <w:iCs/>
-          <w:lang w:val="en-US"/>
-        </w:rPr>
-        <w:t>*</w:t>
-      </w:r>
-      <w:r>
-        <w:rPr>
-          <w:lang w:val="en-US"/>
-        </w:rPr>
-        <w:t xml:space="preserve">* to get </w:t>
-      </w:r>
-      <w:r>
-        <w:rPr>
-          <w:b/>
-          <w:bCs/>
-          <w:i/>
-          <w:iCs/>
-          <w:lang w:val="en-US"/>
-        </w:rPr>
-        <w:t>bold italics</w:t>
-      </w:r>
-    </w:p>
-    <w:p>
-      <w:pPr>
-        <w:pStyle w:val="ListParagraph"/>
-        <w:numPr>
-          <w:ilvl w:val="1"/>
-          <w:numId w:val="5"/>
-        </w:numPr>
-        <w:rPr>
-          <w:rFonts w:eastAsiaTheme="minorEastAsia"/>
-          <w:b/>
-          <w:bCs/>
-          <w:lang w:val="en-US"/>
-        </w:rPr>
-      </w:pPr>
-      <w:r>
-        <w:rPr>
-          <w:lang w:val="en-US"/>
-        </w:rPr>
-        <w:t>To superscript surround the character with caret, e.g., x^2^ to give x</w:t>
-      </w:r>
-      <w:r>
-        <w:rPr>
-          <w:vertAlign w:val="superscript"/>
-          <w:lang w:val="en-US"/>
-        </w:rPr>
-        <w:t>2</w:t>
-      </w:r>
-    </w:p>
-    <w:p>
-      <w:pPr>
-        <w:pStyle w:val="ListParagraph"/>
-        <w:numPr>
-          <w:ilvl w:val="1"/>
-          <w:numId w:val="5"/>
-        </w:numPr>
-        <w:rPr>
-          <w:rFonts w:eastAsiaTheme="minorEastAsia"/>
-          <w:lang w:val="en-US"/>
-        </w:rPr>
-      </w:pPr>
-      <w:r>
-        <w:rPr>
-          <w:lang w:val="en-US"/>
-        </w:rPr>
-        <w:t>To subscript surround the character with tilde, e.g., x</w:t>
-      </w:r>
-      <w:r>
-        <w:rPr>
-          <w:rFonts w:ascii="Calibri" w:eastAsia="Calibri" w:hAnsi="Calibri" w:cs="Calibri"/>
-          <w:color w:val="232629"/>
-          <w:sz w:val="24"/>
-          <w:szCs w:val="24"/>
-        </w:rPr>
-        <w:t xml:space="preserve"> ~</w:t>
-      </w:r>
-      <w:r>
-        <w:rPr>
-          <w:lang w:val="en-US"/>
-        </w:rPr>
-        <w:t>2</w:t>
-      </w:r>
-      <w:r>
-        <w:rPr>
-          <w:rFonts w:ascii="Calibri" w:eastAsia="Calibri" w:hAnsi="Calibri" w:cs="Calibri"/>
-          <w:color w:val="232629"/>
-          <w:sz w:val="24"/>
-          <w:szCs w:val="24"/>
-        </w:rPr>
-        <w:t>~</w:t>
-      </w:r>
-      <w:r>
-        <w:rPr>
-          <w:lang w:val="en-US"/>
-        </w:rPr>
-        <w:t xml:space="preserve"> to give x</w:t>
-      </w:r>
-      <w:r>
-        <w:rPr>
-          <w:vertAlign w:val="subscript"/>
-          <w:lang w:val="en-US"/>
-        </w:rPr>
-        <w:t>2</w:t>
-      </w:r>
-    </w:p>
-    <w:p>
-      <w:pPr>
-        <w:pStyle w:val="ListParagraph"/>
-        <w:numPr>
-          <w:ilvl w:val="0"/>
-          <w:numId w:val="5"/>
-        </w:numPr>
-        <w:rPr>
-          <w:rFonts w:eastAsiaTheme="minorEastAsia"/>
-          <w:lang w:val="en-US"/>
-        </w:rPr>
-      </w:pPr>
-      <w:r>
-        <w:rPr>
-          <w:lang w:val="en-US"/>
-        </w:rPr>
-        <w:t>Color</w:t>
-      </w:r>
-      <w:r>
-        <w:rPr>
-          <w:lang w:val="en-US"/>
-        </w:rPr>
-        <w:t>-coding in the excel files does not work. Footnotes need to be used instead. To include a footnote</w:t>
-      </w:r>
-      <w:r>
-        <w:rPr>
-          <w:lang w:val="en-US"/>
-        </w:rPr>
-        <w:t>, in the cell that the footnote applies the following without the quotes “^[footnote text]”</w:t>
-      </w:r>
-      <w:r>
-        <w:rPr>
-          <w:lang w:val="en-US"/>
-        </w:rPr>
-        <w:t>. More footnotes (e.g. 1, 2, 3) will appear automatically as long as the user adds additional notations as the one shown in the square brackets above.</w:t>
-      </w:r>
-    </w:p>
-    <w:p>
-      <w:pPr>
-        <w:pStyle w:val="ListParagraph"/>
-        <w:numPr>
-          <w:ilvl w:val="0"/>
-          <w:numId w:val="5"/>
-        </w:numPr>
-        <w:rPr>
-          <w:rFonts w:eastAsiaTheme="minorEastAsia"/>
-          <w:lang w:val="en-US"/>
-        </w:rPr>
-      </w:pPr>
-      <w:r>
-        <w:rPr>
-          <w:lang w:val="en-US"/>
-        </w:rPr>
-        <w:t xml:space="preserve">The cells that contain dates need to have the following format without the square brackets </w:t>
+        <w:t>Compilation of the draft Sailing Orders</w:t>
+      </w:r>
+    </w:p>
+    <w:p>
+      <w:r>
+        <w:t xml:space="preserve">If steps A, B and C have been carried out correctly, the user needs to expand the “Knit” menu and select the Knit to rodxc_document option. </w:t>
+      </w:r>
+      <w:r>
+        <w:t xml:space="preserve">Before this, ensure that </w:t>
       </w:r>
       <w:r>
         <w:rPr>
           <w:b/>
           <w:bCs/>
           <w:u w:val="single"/>
-          <w:lang w:val="en-US"/>
-        </w:rPr>
-        <w:t>but with</w:t>
-      </w:r>
-      <w:r>
-        <w:rPr>
-          <w:lang w:val="en-US"/>
-        </w:rPr>
-        <w:t xml:space="preserve"> the apostrophe before the dd: [‘dd/mm/yyyy] . This will convert the date into a character string and avoid the different date format settings </w:t>
-      </w:r>
-      <w:r>
-        <w:rPr>
-          <w:lang w:val="en-US"/>
-        </w:rPr>
-        <w:t>of individual users’ machines.</w:t>
-      </w:r>
-    </w:p>
-    <w:p>
-      <w:pPr>
-        <w:rPr>
-          <w:lang w:val="en-US"/>
-        </w:rPr>
-      </w:pPr>
-    </w:p>
-    <w:p>
-      <w:pPr>
-        <w:rPr>
-          <w:lang w:val="en-US"/>
-        </w:rPr>
-      </w:pPr>
-      <w:r>
-        <w:rPr>
-          <w:lang w:val="en-US"/>
-        </w:rPr>
-        <w:t xml:space="preserve">The user should avoid merging cells in the </w:t>
-      </w:r>
-      <w:r>
-        <w:t>“</w:t>
-      </w:r>
-      <w:r>
-        <w:t>input_dataframes.xlsx</w:t>
-      </w:r>
-      <w:r>
-        <w:t xml:space="preserve">” sheets. The tidier and plainer a table is, the rendering will be the intended one. </w:t>
-      </w:r>
-      <w:r>
-        <w:t>In some cases, additional columns can be added if required, but this is table-dependen</w:t>
-      </w:r>
-      <w:r>
-        <w:t>d</w:t>
-      </w:r>
-      <w:r>
-        <w:t>. In the reqparttab columns A, B and C are not to be renamed</w:t>
-      </w:r>
-      <w:r>
-        <w:t xml:space="preserve">. </w:t>
-      </w:r>
-      <w:r>
-        <w:t>If complicated table structures are required and inevitable, contact Piera Carpi or Nikos Nikolioudakis.</w:t>
-      </w:r>
-    </w:p>
-    <w:p>
-      <w:r>
-        <w:rPr>
-          <w:b/>
-          <w:bCs/>
-        </w:rPr>
-        <w:lastRenderedPageBreak/>
-        <w:t>For step (B)</w:t>
-      </w:r>
-      <w:r>
-        <w:t>, under the _images folder, the user can include all images that are expected to be rendered in the output document. Renaming of the folder name is not allowed. Change of file names of images is permitted (but see further down for instructions). Preferential image format is .png or .jpeg. The code might need to be adjusted accordingly if .jpeg images are included. Once the user has placed the images in the folder, correspondence must be ensured between the file names of the images and what is listed in the “fig</w:t>
-      </w:r>
-      <w:r>
-        <w:t>_</w:t>
-      </w:r>
-      <w:r>
-        <w:t>captions” sheet of the “</w:t>
-      </w:r>
-      <w:r>
-        <w:t>input_dataframes.xlsx</w:t>
-      </w:r>
-      <w:r>
-        <w:t xml:space="preserve">”. Otherwise, the image captions will not be rendered and cross-referencing in the output document will not work as intended. </w:t>
-      </w:r>
-    </w:p>
-    <w:p/>
-    <w:p>
-      <w:r>
-        <w:rPr>
-          <w:b/>
-          <w:bCs/>
-        </w:rPr>
-        <w:t xml:space="preserve">For </w:t>
-      </w:r>
-      <w:r>
-        <w:rPr>
-          <w:b/>
-          <w:bCs/>
-        </w:rPr>
-        <w:t>step (C)</w:t>
-      </w:r>
-      <w:r>
-        <w:t xml:space="preserve">, </w:t>
-      </w:r>
-      <w:r>
-        <w:t>the text editing t</w:t>
-      </w:r>
-      <w:r>
-        <w:t xml:space="preserve">he user is required to open the </w:t>
-      </w:r>
-      <w:r>
-        <w:t>“</w:t>
-      </w:r>
-      <w:r>
-        <w:t>SailingOrdersDFN.Rmd</w:t>
-      </w:r>
-      <w:r>
-        <w:t>”</w:t>
-      </w:r>
-      <w:r>
-        <w:t xml:space="preserve"> file in administrator mode in R-Studio. Renaming of the file name is not allowed. Once opened, the user should click on the icon looking like an “A” (Switch to visual markdown editor).</w:t>
-      </w:r>
-    </w:p>
-    <w:p>
-      <w:r>
-        <w:rPr>
-          <w:noProof/>
-        </w:rPr>
-        <w:drawing>
-          <wp:inline distT="0" distB="0" distL="0" distR="0" wp14:anchorId="1FAB8FBD" wp14:editId="13B61A2F">
-            <wp:extent cx="3829584" cy="1057423"/>
-            <wp:effectExtent l="0" t="0" r="0" b="9525"/>
-            <wp:docPr id="6" name="Picture 6" descr="Graphical user interface, text, application&#10;&#10;Description automatically generated"/>
-            <wp:cNvGraphicFramePr>
-              <a:graphicFrameLocks xmlns:a="http://schemas.openxmlformats.org/drawingml/2006/main" noChangeAspect="1"/>
-            </wp:cNvGraphicFramePr>
-            <a:graphic xmlns:a="http://schemas.openxmlformats.org/drawingml/2006/main">
-              <a:graphicData uri="http://schemas.openxmlformats.org/drawingml/2006/picture">
-                <pic:pic xmlns:pic="http://schemas.openxmlformats.org/drawingml/2006/picture">
-                  <pic:nvPicPr>
-                    <pic:cNvPr id="4" name="Picture 4" descr="Graphical user interface, text, application&#10;&#10;Description automatically generated"/>
-                    <pic:cNvPicPr/>
-                  </pic:nvPicPr>
-                  <pic:blipFill>
-                    <a:blip r:embed="rId14"/>
-                    <a:stretch>
-                      <a:fillRect/>
-                    </a:stretch>
-                  </pic:blipFill>
-                  <pic:spPr>
-                    <a:xfrm>
-                      <a:off x="0" y="0"/>
-                      <a:ext cx="3829584" cy="1057423"/>
-                    </a:xfrm>
-                    <a:prstGeom prst="rect">
-                      <a:avLst/>
-                    </a:prstGeom>
-                  </pic:spPr>
-                </pic:pic>
-              </a:graphicData>
-            </a:graphic>
-          </wp:inline>
-        </w:drawing>
-      </w:r>
-    </w:p>
-    <w:p/>
-    <w:p>
-      <w:r>
-        <w:t>All text edits can be done now in a MS-Word-like environment, through the new toolbar.</w:t>
-      </w:r>
-    </w:p>
-    <w:p>
-      <w:r>
-        <w:rPr>
-          <w:noProof/>
-        </w:rPr>
-        <w:drawing>
-          <wp:inline distT="0" distB="0" distL="0" distR="0" wp14:anchorId="4C172C5B" wp14:editId="300D6A23">
-            <wp:extent cx="5731510" cy="246380"/>
-            <wp:effectExtent l="0" t="0" r="2540" b="1270"/>
-            <wp:docPr id="7" name="Picture 7"/>
-            <wp:cNvGraphicFramePr>
-              <a:graphicFrameLocks xmlns:a="http://schemas.openxmlformats.org/drawingml/2006/main" noChangeAspect="1"/>
-            </wp:cNvGraphicFramePr>
-            <a:graphic xmlns:a="http://schemas.openxmlformats.org/drawingml/2006/main">
-              <a:graphicData uri="http://schemas.openxmlformats.org/drawingml/2006/picture">
-                <pic:pic xmlns:pic="http://schemas.openxmlformats.org/drawingml/2006/picture">
-                  <pic:nvPicPr>
-                    <pic:cNvPr id="1" name=""/>
-                    <pic:cNvPicPr/>
-                  </pic:nvPicPr>
-                  <pic:blipFill>
-                    <a:blip r:embed="rId15"/>
-                    <a:stretch>
-                      <a:fillRect/>
-                    </a:stretch>
-                  </pic:blipFill>
-                  <pic:spPr>
-                    <a:xfrm>
-                      <a:off x="0" y="0"/>
-                      <a:ext cx="5731510" cy="246380"/>
-                    </a:xfrm>
-                    <a:prstGeom prst="rect">
-                      <a:avLst/>
-                    </a:prstGeom>
-                  </pic:spPr>
-                </pic:pic>
-              </a:graphicData>
-            </a:graphic>
-          </wp:inline>
-        </w:drawing>
-      </w:r>
-    </w:p>
-    <w:p>
-      <w:pPr>
-        <w:rPr>
-          <w:b/>
-          <w:bCs/>
-        </w:rPr>
-      </w:pPr>
-      <w:r>
-        <w:rPr>
-          <w:b/>
-          <w:bCs/>
-        </w:rPr>
-        <w:t>Compilation of the draft Sailing Orders</w:t>
-      </w:r>
-    </w:p>
-    <w:p>
-      <w:r>
-        <w:t xml:space="preserve">If steps A, B and C have been carried out correctly, the user needs to expand the “Knit” menu and select the Knit to rodxc_document option. </w:t>
-      </w:r>
-      <w:r>
-        <w:t xml:space="preserve">Before this, ensure that </w:t>
-      </w:r>
-      <w:r>
-        <w:rPr>
-          <w:u w:val="single"/>
         </w:rPr>
         <w:t>you do not have</w:t>
       </w:r>
@@ -2964,10 +3477,22 @@
         <w:t>location of the “</w:t>
       </w:r>
       <w:r>
-        <w:t>SailingOrdersDFN.doc</w:t>
-      </w:r>
-      <w:r>
-        <w:t xml:space="preserve">x” is in the .Rproj directory. </w:t>
+        <w:t>SailingOrdersDFN</w:t>
+      </w:r>
+      <w:r>
+        <w:t>_pelagic</w:t>
+      </w:r>
+      <w:r>
+        <w:t>.doc</w:t>
+      </w:r>
+      <w:r>
+        <w:t>x”</w:t>
+      </w:r>
+      <w:r>
+        <w:t xml:space="preserve"> or “SailingOrdersDFN_demersal.docx”</w:t>
+      </w:r>
+      <w:r>
+        <w:t xml:space="preserve"> is in the .Rproj directory. </w:t>
       </w:r>
     </w:p>
     <w:p>
@@ -2991,7 +3516,7 @@
                     <pic:cNvPicPr/>
                   </pic:nvPicPr>
                   <pic:blipFill>
-                    <a:blip r:embed="rId16"/>
+                    <a:blip r:embed="rId17"/>
                     <a:stretch>
                       <a:fillRect/>
                     </a:stretch>
@@ -3015,7 +3540,13 @@
     <w:p/>
     <w:p>
       <w:r>
-        <w:t>At this point, the draft Sailing Orders can be shared with the pre-survey meeting participants or any other person involved</w:t>
+        <w:t>At this point, the draft Sailing Orders can be shared with the pre-survey meeting participants</w:t>
+      </w:r>
+      <w:r>
+        <w:t xml:space="preserve">, </w:t>
+      </w:r>
+      <w:r>
+        <w:t>or any other person involved</w:t>
       </w:r>
       <w:r>
         <w:t xml:space="preserve">, as a .docx. </w:t>
@@ -3046,11 +3577,13 @@
     </w:p>
     <w:p>
       <w:r>
-        <w:lastRenderedPageBreak/>
         <w:t xml:space="preserve">Text edits on the </w:t>
       </w:r>
       <w:r>
-        <w:t>draft SailingOrdersDFN</w:t>
+        <w:t xml:space="preserve">draft </w:t>
+      </w:r>
+      <w:r>
+        <w:t xml:space="preserve">knitted </w:t>
       </w:r>
       <w:r>
         <w:t>.docx, comments, track changes etc. need to be resolved and accepted/rejected. Then, the final, updated text</w:t>
@@ -3059,7 +3592,19 @@
         <w:t xml:space="preserve"> </w:t>
       </w:r>
       <w:r>
-        <w:t xml:space="preserve">needs to be included in the “SailingOrdersDFN.Rmd” file and recompiled. </w:t>
+        <w:t>needs to be included in the “SailingOrdersDFN</w:t>
+      </w:r>
+      <w:r>
+        <w:t>_pelagic</w:t>
+      </w:r>
+      <w:r>
+        <w:t>.Rmd”</w:t>
+      </w:r>
+      <w:r>
+        <w:t xml:space="preserve"> (or “SailingOrdersDFN_demersal.Rmd”)</w:t>
+      </w:r>
+      <w:r>
+        <w:t xml:space="preserve"> file and recompiled. </w:t>
       </w:r>
     </w:p>
     <w:p>
@@ -3292,7 +3837,19 @@
         </w:numPr>
       </w:pPr>
       <w:r>
-        <w:t xml:space="preserve">Open the “SailingOrdersDFN.Rmd” file with the process described in </w:t>
+        <w:t>Open the “SailingOrdersDFN</w:t>
+      </w:r>
+      <w:r>
+        <w:t>_pelagic</w:t>
+      </w:r>
+      <w:r>
+        <w:t>.Rmd”</w:t>
+      </w:r>
+      <w:r>
+        <w:t xml:space="preserve"> or ““SailingOrdersDFN_demersal.Rmd””</w:t>
+      </w:r>
+      <w:r>
+        <w:t xml:space="preserve"> file with the process described in </w:t>
       </w:r>
       <w:r>
         <w:rPr>
@@ -3314,7 +3871,13 @@
         </w:numPr>
       </w:pPr>
       <w:r>
-        <w:t>Let’s assume that you want to include the new table that you created in step 1 under “ANNEX V. Survey-specific additional sampling” location. Find any other table code chunk, e.g. the table “</w:t>
+        <w:t>Let’s assume that you want to include the new table that you created in step 1 under “ANNEX V. Survey-specific additional sampling” location. Find any other table code chunk, e.g.</w:t>
+      </w:r>
+      <w:r>
+        <w:t>,</w:t>
+      </w:r>
+      <w:r>
+        <w:t xml:space="preserve"> the table “</w:t>
       </w:r>
       <w:r>
         <w:t>equipmenttab</w:t>
@@ -3332,7 +3895,13 @@
         </w:numPr>
       </w:pPr>
       <w:r>
-        <w:t>Copy the table code chunk by selecting it and copying it with Ctrl+C . The code chunk is looking like this:</w:t>
+        <w:t>Copy the table code chunk by selecting it and copying it with Ctrl+</w:t>
+      </w:r>
+      <w:r>
+        <w:t>c</w:t>
+      </w:r>
+      <w:r>
+        <w:t xml:space="preserve"> . The code chunk is looking like this:</w:t>
       </w:r>
     </w:p>
     <w:p>
@@ -3363,7 +3932,7 @@
                     <pic:cNvPicPr/>
                   </pic:nvPicPr>
                   <pic:blipFill>
-                    <a:blip r:embed="rId17"/>
+                    <a:blip r:embed="rId18"/>
                     <a:stretch>
                       <a:fillRect/>
                     </a:stretch>
@@ -3517,7 +4086,19 @@
         </w:numPr>
       </w:pPr>
       <w:r>
-        <w:t xml:space="preserve">Open the “SailingOrdersDFN.Rmd” file with the process described in </w:t>
+        <w:t>Open the “SailingOrdersDFN</w:t>
+      </w:r>
+      <w:r>
+        <w:t>_pelagic</w:t>
+      </w:r>
+      <w:r>
+        <w:t>.Rmd”</w:t>
+      </w:r>
+      <w:r>
+        <w:t xml:space="preserve"> (or “SailingOrdersDFN_demersal.Rmd”)</w:t>
+      </w:r>
+      <w:r>
+        <w:t xml:space="preserve"> file with the process described in </w:t>
       </w:r>
       <w:r>
         <w:rPr>
@@ -3557,7 +4138,13 @@
         </w:numPr>
       </w:pPr>
       <w:r>
-        <w:t>Copy the table code chunk by selecting it and copying it with Ctrl+C . The code chunk is looking like this:</w:t>
+        <w:t>Copy the table code chunk by selecting it and copying it with Ctrl+</w:t>
+      </w:r>
+      <w:r>
+        <w:t>c</w:t>
+      </w:r>
+      <w:r>
+        <w:t xml:space="preserve"> . The code chunk is looking like this:</w:t>
       </w:r>
     </w:p>
     <w:p>
@@ -3587,7 +4174,7 @@
                     <pic:cNvPicPr/>
                   </pic:nvPicPr>
                   <pic:blipFill>
-                    <a:blip r:embed="rId18"/>
+                    <a:blip r:embed="rId19"/>
                     <a:stretch>
                       <a:fillRect/>
                     </a:stretch>
@@ -3661,14 +4248,10 @@
       <w:r>
         <w:t xml:space="preserve"> (ANNEX V)</w:t>
       </w:r>
-    </w:p>
-    <w:p>
-      <w:pPr>
-        <w:pStyle w:val="ListParagraph"/>
-      </w:pPr>
-    </w:p>
-    <w:p/>
-    <w:p/>
+      <w:r>
+        <w:t>.</w:t>
+      </w:r>
+    </w:p>
     <w:sectPr>
       <w:pgSz w:w="11906" w:h="16838"/>
       <w:pgMar w:top="1440" w:right="1440" w:bottom="1440" w:left="1440" w:header="708" w:footer="708" w:gutter="0"/>

</xml_diff>

<commit_message>
minor edits in the user guide and debugging
</commit_message>
<xml_diff>
--- a/SailingOrdersDFN_User_Manual.docx
+++ b/SailingOrdersDFN_User_Manual.docx
@@ -4252,6 +4252,73 @@
         <w:t>.</w:t>
       </w:r>
     </w:p>
+    <w:p>
+      <w:pPr>
+        <w:ind w:left="360"/>
+        <w:rPr>
+          <w:b/>
+          <w:bCs/>
+          <w:u w:val="single"/>
+          <w:lang w:val="en-US"/>
+        </w:rPr>
+      </w:pPr>
+      <w:r>
+        <w:rPr>
+          <w:b/>
+          <w:bCs/>
+          <w:u w:val="single"/>
+          <w:lang w:val="en-US"/>
+        </w:rPr>
+        <w:lastRenderedPageBreak/>
+        <w:t>How to create an in-text reference to a specific Annex</w:t>
+      </w:r>
+    </w:p>
+    <w:p>
+      <w:pPr>
+        <w:ind w:left="360"/>
+        <w:rPr>
+          <w:lang w:val="en-US"/>
+        </w:rPr>
+      </w:pPr>
+    </w:p>
+    <w:p>
+      <w:pPr>
+        <w:pStyle w:val="ListParagraph"/>
+        <w:numPr>
+          <w:ilvl w:val="0"/>
+          <w:numId w:val="21"/>
+        </w:numPr>
+        <w:ind w:left="360"/>
+        <w:rPr>
+          <w:lang w:val="en-US"/>
+        </w:rPr>
+      </w:pPr>
+      <w:r>
+        <w:rPr>
+          <w:lang w:val="en-US"/>
+        </w:rPr>
+        <w:t>Switch to source editor mode (not visual markdown editor mode) by pressing the icon looking like an “A”.</w:t>
+      </w:r>
+    </w:p>
+    <w:p>
+      <w:pPr>
+        <w:pStyle w:val="ListParagraph"/>
+        <w:numPr>
+          <w:ilvl w:val="0"/>
+          <w:numId w:val="21"/>
+        </w:numPr>
+        <w:ind w:left="360"/>
+        <w:rPr>
+          <w:lang w:val="en-US"/>
+        </w:rPr>
+      </w:pPr>
+      <w:r>
+        <w:rPr>
+          <w:lang w:val="en-US"/>
+        </w:rPr>
+        <w:t>In the source editor mode, ensure that the desired annex reference is written in the following format: [ANNEX I](#ANNEX_I)</w:t>
+      </w:r>
+    </w:p>
     <w:sectPr>
       <w:pgSz w:w="11906" w:h="16838"/>
       <w:pgMar w:top="1440" w:right="1440" w:bottom="1440" w:left="1440" w:header="708" w:footer="708" w:gutter="0"/>
@@ -4277,6 +4344,92 @@
 <file path=word/numbering.xml><?xml version="1.0" encoding="utf-8"?>
 <w:numbering xmlns:wpc="http://schemas.microsoft.com/office/word/2010/wordprocessingCanvas" xmlns:cx="http://schemas.microsoft.com/office/drawing/2014/chartex" xmlns:cx1="http://schemas.microsoft.com/office/drawing/2015/9/8/chartex" xmlns:cx2="http://schemas.microsoft.com/office/drawing/2015/10/21/chartex" xmlns:cx3="http://schemas.microsoft.com/office/drawing/2016/5/9/chartex" xmlns:cx4="http://schemas.microsoft.com/office/drawing/2016/5/10/chartex" xmlns:cx5="http://schemas.microsoft.com/office/drawing/2016/5/11/chartex" xmlns:cx6="http://schemas.microsoft.com/office/drawing/2016/5/12/chartex" xmlns:cx7="http://schemas.microsoft.com/office/drawing/2016/5/13/chartex" xmlns:cx8="http://schemas.microsoft.com/office/drawing/2016/5/14/chartex" xmlns:mc="http://schemas.openxmlformats.org/markup-compatibility/2006" xmlns:aink="http://schemas.microsoft.com/office/drawing/2016/ink" xmlns:am3d="http://schemas.microsoft.com/office/drawing/2017/model3d" xmlns:o="urn:schemas-microsoft-com:office:office" xmlns:r="http://schemas.openxmlformats.org/officeDocument/2006/relationships" xmlns:m="http://schemas.openxmlformats.org/officeDocument/2006/math" xmlns:v="urn:schemas-microsoft-com:vml" xmlns:wp14="http://schemas.microsoft.com/office/word/2010/wordprocessingDrawing" xmlns:wp="http://schemas.openxmlformats.org/drawingml/2006/wordprocessingDrawing" xmlns:w10="urn:schemas-microsoft-com:office:word" xmlns:w="http://schemas.openxmlformats.org/wordprocessingml/2006/main" xmlns:w14="http://schemas.microsoft.com/office/word/2010/wordml" xmlns:w15="http://schemas.microsoft.com/office/word/2012/wordml" xmlns:w16cex="http://schemas.microsoft.com/office/word/2018/wordml/cex" xmlns:w16cid="http://schemas.microsoft.com/office/word/2016/wordml/cid" xmlns:w16="http://schemas.microsoft.com/office/word/2018/wordml" xmlns:w16sdtdh="http://schemas.microsoft.com/office/word/2020/wordml/sdtdatahash" xmlns:w16se="http://schemas.microsoft.com/office/word/2015/wordml/symex" xmlns:wpg="http://schemas.microsoft.com/office/word/2010/wordprocessingGroup" xmlns:wpi="http://schemas.microsoft.com/office/word/2010/wordprocessingInk" xmlns:wne="http://schemas.microsoft.com/office/word/2006/wordml" xmlns:wps="http://schemas.microsoft.com/office/word/2010/wordprocessingShape" mc:Ignorable="w14 w15 w16se w16cid w16 w16cex w16sdtdh wp14">
   <w:abstractNum w:abstractNumId="0" w15:restartNumberingAfterBreak="0">
+    <w:nsid w:val="016E1610"/>
+    <w:multiLevelType w:val="hybridMultilevel"/>
+    <w:tmpl w:val="4A783140"/>
+    <w:lvl w:ilvl="0" w:tplc="0414000F">
+      <w:start w:val="1"/>
+      <w:numFmt w:val="decimal"/>
+      <w:lvlText w:val="%1."/>
+      <w:lvlJc w:val="left"/>
+      <w:pPr>
+        <w:ind w:left="1080" w:hanging="360"/>
+      </w:pPr>
+    </w:lvl>
+    <w:lvl w:ilvl="1" w:tplc="04140019" w:tentative="1">
+      <w:start w:val="1"/>
+      <w:numFmt w:val="lowerLetter"/>
+      <w:lvlText w:val="%2."/>
+      <w:lvlJc w:val="left"/>
+      <w:pPr>
+        <w:ind w:left="1800" w:hanging="360"/>
+      </w:pPr>
+    </w:lvl>
+    <w:lvl w:ilvl="2" w:tplc="0414001B" w:tentative="1">
+      <w:start w:val="1"/>
+      <w:numFmt w:val="lowerRoman"/>
+      <w:lvlText w:val="%3."/>
+      <w:lvlJc w:val="right"/>
+      <w:pPr>
+        <w:ind w:left="2520" w:hanging="180"/>
+      </w:pPr>
+    </w:lvl>
+    <w:lvl w:ilvl="3" w:tplc="0414000F" w:tentative="1">
+      <w:start w:val="1"/>
+      <w:numFmt w:val="decimal"/>
+      <w:lvlText w:val="%4."/>
+      <w:lvlJc w:val="left"/>
+      <w:pPr>
+        <w:ind w:left="3240" w:hanging="360"/>
+      </w:pPr>
+    </w:lvl>
+    <w:lvl w:ilvl="4" w:tplc="04140019" w:tentative="1">
+      <w:start w:val="1"/>
+      <w:numFmt w:val="lowerLetter"/>
+      <w:lvlText w:val="%5."/>
+      <w:lvlJc w:val="left"/>
+      <w:pPr>
+        <w:ind w:left="3960" w:hanging="360"/>
+      </w:pPr>
+    </w:lvl>
+    <w:lvl w:ilvl="5" w:tplc="0414001B" w:tentative="1">
+      <w:start w:val="1"/>
+      <w:numFmt w:val="lowerRoman"/>
+      <w:lvlText w:val="%6."/>
+      <w:lvlJc w:val="right"/>
+      <w:pPr>
+        <w:ind w:left="4680" w:hanging="180"/>
+      </w:pPr>
+    </w:lvl>
+    <w:lvl w:ilvl="6" w:tplc="0414000F" w:tentative="1">
+      <w:start w:val="1"/>
+      <w:numFmt w:val="decimal"/>
+      <w:lvlText w:val="%7."/>
+      <w:lvlJc w:val="left"/>
+      <w:pPr>
+        <w:ind w:left="5400" w:hanging="360"/>
+      </w:pPr>
+    </w:lvl>
+    <w:lvl w:ilvl="7" w:tplc="04140019" w:tentative="1">
+      <w:start w:val="1"/>
+      <w:numFmt w:val="lowerLetter"/>
+      <w:lvlText w:val="%8."/>
+      <w:lvlJc w:val="left"/>
+      <w:pPr>
+        <w:ind w:left="6120" w:hanging="360"/>
+      </w:pPr>
+    </w:lvl>
+    <w:lvl w:ilvl="8" w:tplc="0414001B" w:tentative="1">
+      <w:start w:val="1"/>
+      <w:numFmt w:val="lowerRoman"/>
+      <w:lvlText w:val="%9."/>
+      <w:lvlJc w:val="right"/>
+      <w:pPr>
+        <w:ind w:left="6840" w:hanging="180"/>
+      </w:pPr>
+    </w:lvl>
+  </w:abstractNum>
+  <w:abstractNum w:abstractNumId="1" w15:restartNumberingAfterBreak="0">
     <w:nsid w:val="06692234"/>
     <w:multiLevelType w:val="hybridMultilevel"/>
     <w:tmpl w:val="4EA47D94"/>
@@ -4389,7 +4542,7 @@
       </w:rPr>
     </w:lvl>
   </w:abstractNum>
-  <w:abstractNum w:abstractNumId="1" w15:restartNumberingAfterBreak="0">
+  <w:abstractNum w:abstractNumId="2" w15:restartNumberingAfterBreak="0">
     <w:nsid w:val="0BB66723"/>
     <w:multiLevelType w:val="multilevel"/>
     <w:tmpl w:val="0809001F"/>
@@ -4478,7 +4631,7 @@
       </w:pPr>
     </w:lvl>
   </w:abstractNum>
-  <w:abstractNum w:abstractNumId="2" w15:restartNumberingAfterBreak="0">
+  <w:abstractNum w:abstractNumId="3" w15:restartNumberingAfterBreak="0">
     <w:nsid w:val="22A4210F"/>
     <w:multiLevelType w:val="multilevel"/>
     <w:tmpl w:val="0809001F"/>
@@ -4564,7 +4717,7 @@
       </w:pPr>
     </w:lvl>
   </w:abstractNum>
-  <w:abstractNum w:abstractNumId="3" w15:restartNumberingAfterBreak="0">
+  <w:abstractNum w:abstractNumId="4" w15:restartNumberingAfterBreak="0">
     <w:nsid w:val="2647278D"/>
     <w:multiLevelType w:val="hybridMultilevel"/>
     <w:tmpl w:val="775805C4"/>
@@ -4653,7 +4806,7 @@
       </w:pPr>
     </w:lvl>
   </w:abstractNum>
-  <w:abstractNum w:abstractNumId="4" w15:restartNumberingAfterBreak="0">
+  <w:abstractNum w:abstractNumId="5" w15:restartNumberingAfterBreak="0">
     <w:nsid w:val="2EE07AA9"/>
     <w:multiLevelType w:val="hybridMultilevel"/>
     <w:tmpl w:val="CE4CF118"/>
@@ -4739,7 +4892,7 @@
       </w:pPr>
     </w:lvl>
   </w:abstractNum>
-  <w:abstractNum w:abstractNumId="5" w15:restartNumberingAfterBreak="0">
+  <w:abstractNum w:abstractNumId="6" w15:restartNumberingAfterBreak="0">
     <w:nsid w:val="337F5407"/>
     <w:multiLevelType w:val="hybridMultilevel"/>
     <w:tmpl w:val="FFFFFFFF"/>
@@ -4825,7 +4978,7 @@
       </w:pPr>
     </w:lvl>
   </w:abstractNum>
-  <w:abstractNum w:abstractNumId="6" w15:restartNumberingAfterBreak="0">
+  <w:abstractNum w:abstractNumId="7" w15:restartNumberingAfterBreak="0">
     <w:nsid w:val="358F62C4"/>
     <w:multiLevelType w:val="hybridMultilevel"/>
     <w:tmpl w:val="0F42B416"/>
@@ -4914,7 +5067,7 @@
       </w:pPr>
     </w:lvl>
   </w:abstractNum>
-  <w:abstractNum w:abstractNumId="7" w15:restartNumberingAfterBreak="0">
+  <w:abstractNum w:abstractNumId="8" w15:restartNumberingAfterBreak="0">
     <w:nsid w:val="3A0F1553"/>
     <w:multiLevelType w:val="multilevel"/>
     <w:tmpl w:val="DBAACAC2"/>
@@ -5035,7 +5188,7 @@
       </w:rPr>
     </w:lvl>
   </w:abstractNum>
-  <w:abstractNum w:abstractNumId="8" w15:restartNumberingAfterBreak="0">
+  <w:abstractNum w:abstractNumId="9" w15:restartNumberingAfterBreak="0">
     <w:nsid w:val="3C04167F"/>
     <w:multiLevelType w:val="hybridMultilevel"/>
     <w:tmpl w:val="50CE4646"/>
@@ -5148,7 +5301,7 @@
       </w:rPr>
     </w:lvl>
   </w:abstractNum>
-  <w:abstractNum w:abstractNumId="9" w15:restartNumberingAfterBreak="0">
+  <w:abstractNum w:abstractNumId="10" w15:restartNumberingAfterBreak="0">
     <w:nsid w:val="44454268"/>
     <w:multiLevelType w:val="hybridMultilevel"/>
     <w:tmpl w:val="150E1DF4"/>
@@ -5237,7 +5390,7 @@
       </w:pPr>
     </w:lvl>
   </w:abstractNum>
-  <w:abstractNum w:abstractNumId="10" w15:restartNumberingAfterBreak="0">
+  <w:abstractNum w:abstractNumId="11" w15:restartNumberingAfterBreak="0">
     <w:nsid w:val="46FA378A"/>
     <w:multiLevelType w:val="multilevel"/>
     <w:tmpl w:val="0809001F"/>
@@ -5323,7 +5476,7 @@
       </w:pPr>
     </w:lvl>
   </w:abstractNum>
-  <w:abstractNum w:abstractNumId="11" w15:restartNumberingAfterBreak="0">
+  <w:abstractNum w:abstractNumId="12" w15:restartNumberingAfterBreak="0">
     <w:nsid w:val="472E6411"/>
     <w:multiLevelType w:val="hybridMultilevel"/>
     <w:tmpl w:val="FFFFFFFF"/>
@@ -5409,7 +5562,7 @@
       </w:pPr>
     </w:lvl>
   </w:abstractNum>
-  <w:abstractNum w:abstractNumId="12" w15:restartNumberingAfterBreak="0">
+  <w:abstractNum w:abstractNumId="13" w15:restartNumberingAfterBreak="0">
     <w:nsid w:val="5A315762"/>
     <w:multiLevelType w:val="hybridMultilevel"/>
     <w:tmpl w:val="D66A564A"/>
@@ -5498,7 +5651,7 @@
       </w:pPr>
     </w:lvl>
   </w:abstractNum>
-  <w:abstractNum w:abstractNumId="13" w15:restartNumberingAfterBreak="0">
+  <w:abstractNum w:abstractNumId="14" w15:restartNumberingAfterBreak="0">
     <w:nsid w:val="5B28665C"/>
     <w:multiLevelType w:val="hybridMultilevel"/>
     <w:tmpl w:val="97041062"/>
@@ -5581,7 +5734,7 @@
       </w:pPr>
     </w:lvl>
   </w:abstractNum>
-  <w:abstractNum w:abstractNumId="14" w15:restartNumberingAfterBreak="0">
+  <w:abstractNum w:abstractNumId="15" w15:restartNumberingAfterBreak="0">
     <w:nsid w:val="5C3408C9"/>
     <w:multiLevelType w:val="hybridMultilevel"/>
     <w:tmpl w:val="FFFFFFFF"/>
@@ -5667,7 +5820,7 @@
       </w:pPr>
     </w:lvl>
   </w:abstractNum>
-  <w:abstractNum w:abstractNumId="15" w15:restartNumberingAfterBreak="0">
+  <w:abstractNum w:abstractNumId="16" w15:restartNumberingAfterBreak="0">
     <w:nsid w:val="619B4D49"/>
     <w:multiLevelType w:val="hybridMultilevel"/>
     <w:tmpl w:val="F70C3E92"/>
@@ -5779,7 +5932,7 @@
       </w:rPr>
     </w:lvl>
   </w:abstractNum>
-  <w:abstractNum w:abstractNumId="16" w15:restartNumberingAfterBreak="0">
+  <w:abstractNum w:abstractNumId="17" w15:restartNumberingAfterBreak="0">
     <w:nsid w:val="76057600"/>
     <w:multiLevelType w:val="hybridMultilevel"/>
     <w:tmpl w:val="10DE548A"/>
@@ -5868,7 +6021,7 @@
       </w:pPr>
     </w:lvl>
   </w:abstractNum>
-  <w:abstractNum w:abstractNumId="17" w15:restartNumberingAfterBreak="0">
+  <w:abstractNum w:abstractNumId="18" w15:restartNumberingAfterBreak="0">
     <w:nsid w:val="7CDA0138"/>
     <w:multiLevelType w:val="hybridMultilevel"/>
     <w:tmpl w:val="0F42B416"/>
@@ -5958,67 +6111,70 @@
     </w:lvl>
   </w:abstractNum>
   <w:num w:numId="1" w16cid:durableId="1956867094">
-    <w:abstractNumId w:val="5"/>
+    <w:abstractNumId w:val="6"/>
   </w:num>
   <w:num w:numId="2" w16cid:durableId="1923642442">
+    <w:abstractNumId w:val="15"/>
+  </w:num>
+  <w:num w:numId="3" w16cid:durableId="1777359482">
+    <w:abstractNumId w:val="12"/>
+  </w:num>
+  <w:num w:numId="4" w16cid:durableId="126049336">
+    <w:abstractNumId w:val="10"/>
+  </w:num>
+  <w:num w:numId="5" w16cid:durableId="1002247346">
+    <w:abstractNumId w:val="1"/>
+  </w:num>
+  <w:num w:numId="6" w16cid:durableId="1842354018">
+    <w:abstractNumId w:val="16"/>
+  </w:num>
+  <w:num w:numId="7" w16cid:durableId="1362169565">
     <w:abstractNumId w:val="14"/>
   </w:num>
-  <w:num w:numId="3" w16cid:durableId="1777359482">
-    <w:abstractNumId w:val="11"/>
-  </w:num>
-  <w:num w:numId="4" w16cid:durableId="126049336">
-    <w:abstractNumId w:val="9"/>
-  </w:num>
-  <w:num w:numId="5" w16cid:durableId="1002247346">
-    <w:abstractNumId w:val="0"/>
-  </w:num>
-  <w:num w:numId="6" w16cid:durableId="1842354018">
-    <w:abstractNumId w:val="15"/>
-  </w:num>
-  <w:num w:numId="7" w16cid:durableId="1362169565">
-    <w:abstractNumId w:val="13"/>
-  </w:num>
   <w:num w:numId="8" w16cid:durableId="202911940">
-    <w:abstractNumId w:val="13"/>
+    <w:abstractNumId w:val="14"/>
     <w:lvlOverride w:ilvl="0">
       <w:startOverride w:val="1"/>
     </w:lvlOverride>
   </w:num>
   <w:num w:numId="9" w16cid:durableId="2049799606">
-    <w:abstractNumId w:val="1"/>
+    <w:abstractNumId w:val="2"/>
   </w:num>
   <w:num w:numId="10" w16cid:durableId="514078534">
-    <w:abstractNumId w:val="16"/>
+    <w:abstractNumId w:val="17"/>
   </w:num>
   <w:num w:numId="11" w16cid:durableId="742070115">
+    <w:abstractNumId w:val="5"/>
+  </w:num>
+  <w:num w:numId="12" w16cid:durableId="323945420">
+    <w:abstractNumId w:val="2"/>
+  </w:num>
+  <w:num w:numId="13" w16cid:durableId="292827197">
+    <w:abstractNumId w:val="11"/>
+  </w:num>
+  <w:num w:numId="14" w16cid:durableId="965349978">
+    <w:abstractNumId w:val="3"/>
+  </w:num>
+  <w:num w:numId="15" w16cid:durableId="488862069">
+    <w:abstractNumId w:val="8"/>
+  </w:num>
+  <w:num w:numId="16" w16cid:durableId="875658855">
+    <w:abstractNumId w:val="9"/>
+  </w:num>
+  <w:num w:numId="17" w16cid:durableId="596257278">
     <w:abstractNumId w:val="4"/>
   </w:num>
-  <w:num w:numId="12" w16cid:durableId="323945420">
-    <w:abstractNumId w:val="1"/>
+  <w:num w:numId="18" w16cid:durableId="1569875078">
+    <w:abstractNumId w:val="13"/>
   </w:num>
-  <w:num w:numId="13" w16cid:durableId="292827197">
-    <w:abstractNumId w:val="10"/>
+  <w:num w:numId="19" w16cid:durableId="342170053">
+    <w:abstractNumId w:val="18"/>
   </w:num>
-  <w:num w:numId="14" w16cid:durableId="965349978">
-    <w:abstractNumId w:val="2"/>
-  </w:num>
-  <w:num w:numId="15" w16cid:durableId="488862069">
+  <w:num w:numId="20" w16cid:durableId="1844978690">
     <w:abstractNumId w:val="7"/>
   </w:num>
-  <w:num w:numId="16" w16cid:durableId="875658855">
-    <w:abstractNumId w:val="8"/>
-  </w:num>
-  <w:num w:numId="17" w16cid:durableId="596257278">
-    <w:abstractNumId w:val="3"/>
-  </w:num>
-  <w:num w:numId="18" w16cid:durableId="1569875078">
-    <w:abstractNumId w:val="12"/>
-  </w:num>
-  <w:num w:numId="19" w16cid:durableId="342170053">
-    <w:abstractNumId w:val="17"/>
-  </w:num>
-  <w:num w:numId="20" w16cid:durableId="1844978690">
-    <w:abstractNumId w:val="6"/>
+  <w:num w:numId="21" w16cid:durableId="168450947">
+    <w:abstractNumId w:val="0"/>
   </w:num>
 </w:numbering>
 </file>

</xml_diff>